<commit_message>
v8 print - 1st correction
</commit_message>
<xml_diff>
--- a/PHASE 1 REPORT/Report Draft/PROJECT PHASE_I REPORT v7.docx
+++ b/PHASE 1 REPORT/Report Draft/PROJECT PHASE_I REPORT v7.docx
@@ -1261,7 +1261,6 @@
         </w:rPr>
         <w:t xml:space="preserve"> </w:t>
       </w:r>
-      <w:proofErr w:type="spellStart"/>
       <w:r>
         <w:rPr>
           <w:rFonts w:ascii="Times New Roman" w:hAnsi="Times New Roman"/>
@@ -1271,7 +1270,6 @@
         </w:rPr>
         <w:t>bonafide</w:t>
       </w:r>
-      <w:proofErr w:type="spellEnd"/>
       <w:r>
         <w:rPr>
           <w:rFonts w:ascii="Times New Roman" w:hAnsi="Times New Roman"/>
@@ -3768,6 +3766,38 @@
               <w:rPr>
                 <w:sz w:val="24"/>
               </w:rPr>
+              <w:t>3.1</w:t>
+            </w:r>
+          </w:p>
+          <w:p>
+            <w:pPr>
+              <w:pStyle w:val="TableParagraph"/>
+              <w:spacing w:before="217"/>
+              <w:ind w:left="641"/>
+              <w:rPr>
+                <w:sz w:val="24"/>
+              </w:rPr>
+            </w:pPr>
+            <w:r>
+              <w:rPr>
+                <w:sz w:val="24"/>
+              </w:rPr>
+              <w:t>3.1.1</w:t>
+            </w:r>
+          </w:p>
+          <w:p>
+            <w:pPr>
+              <w:pStyle w:val="TableParagraph"/>
+              <w:spacing w:before="217"/>
+              <w:ind w:left="641"/>
+              <w:rPr>
+                <w:sz w:val="24"/>
+              </w:rPr>
+            </w:pPr>
+            <w:r>
+              <w:rPr>
+                <w:sz w:val="24"/>
+              </w:rPr>
               <w:t>3.</w:t>
             </w:r>
             <w:r>
@@ -3802,10 +3832,54 @@
           <w:p>
             <w:pPr>
               <w:pStyle w:val="TableParagraph"/>
-              <w:spacing w:before="2"/>
-              <w:rPr>
-                <w:b/>
-                <w:sz w:val="23"/>
+              <w:spacing w:before="223"/>
+              <w:ind w:left="622"/>
+              <w:rPr>
+                <w:sz w:val="24"/>
+              </w:rPr>
+            </w:pPr>
+            <w:r>
+              <w:rPr>
+                <w:sz w:val="24"/>
+              </w:rPr>
+              <w:t>A1.1.</w:t>
+            </w:r>
+            <w:r>
+              <w:rPr>
+                <w:sz w:val="24"/>
+              </w:rPr>
+              <w:t>2</w:t>
+            </w:r>
+          </w:p>
+          <w:p>
+            <w:pPr>
+              <w:pStyle w:val="TableParagraph"/>
+              <w:spacing w:before="223"/>
+              <w:ind w:left="622"/>
+              <w:rPr>
+                <w:sz w:val="24"/>
+              </w:rPr>
+            </w:pPr>
+            <w:r>
+              <w:rPr>
+                <w:sz w:val="24"/>
+              </w:rPr>
+              <w:t>A1.1.</w:t>
+            </w:r>
+            <w:r>
+              <w:rPr>
+                <w:sz w:val="24"/>
+              </w:rPr>
+              <w:t>3</w:t>
+            </w:r>
+          </w:p>
+          <w:p>
+            <w:pPr>
+              <w:pStyle w:val="TableParagraph"/>
+              <w:spacing w:before="223"/>
+              <w:ind w:left="622"/>
+              <w:rPr>
+                <w:sz w:val="24"/>
               </w:rPr>
             </w:pPr>
           </w:p>
@@ -3826,6 +3900,68 @@
           </w:tcPr>
           <w:p>
             <w:pPr>
+              <w:spacing w:after="0" w:line="240" w:lineRule="auto"/>
+              <w:ind w:left="360"/>
+              <w:rPr>
+                <w:rFonts w:ascii="Times New Roman" w:hAnsi="Times New Roman"/>
+                <w:iCs/>
+                <w:sz w:val="24"/>
+                <w:szCs w:val="24"/>
+              </w:rPr>
+            </w:pPr>
+          </w:p>
+          <w:p>
+            <w:pPr>
+              <w:spacing w:after="0" w:line="240" w:lineRule="auto"/>
+              <w:ind w:left="360"/>
+              <w:rPr>
+                <w:rFonts w:ascii="Times New Roman" w:hAnsi="Times New Roman"/>
+                <w:iCs/>
+                <w:sz w:val="24"/>
+                <w:szCs w:val="24"/>
+              </w:rPr>
+            </w:pPr>
+            <w:r>
+              <w:rPr>
+                <w:rFonts w:ascii="Times New Roman" w:hAnsi="Times New Roman"/>
+                <w:iCs/>
+                <w:sz w:val="24"/>
+                <w:szCs w:val="24"/>
+              </w:rPr>
+              <w:t xml:space="preserve"> </w:t>
+            </w:r>
+            <w:r>
+              <w:rPr>
+                <w:rFonts w:ascii="Times New Roman" w:hAnsi="Times New Roman"/>
+                <w:iCs/>
+                <w:sz w:val="24"/>
+                <w:szCs w:val="24"/>
+              </w:rPr>
+              <w:t xml:space="preserve">Sample Images from </w:t>
+            </w:r>
+            <w:proofErr w:type="spellStart"/>
+            <w:r>
+              <w:rPr>
+                <w:rFonts w:ascii="Times New Roman" w:hAnsi="Times New Roman"/>
+                <w:iCs/>
+                <w:sz w:val="24"/>
+                <w:szCs w:val="24"/>
+              </w:rPr>
+              <w:t>PothRGB</w:t>
+            </w:r>
+            <w:proofErr w:type="spellEnd"/>
+            <w:r>
+              <w:rPr>
+                <w:rFonts w:ascii="Times New Roman" w:hAnsi="Times New Roman"/>
+                <w:iCs/>
+                <w:sz w:val="24"/>
+                <w:szCs w:val="24"/>
+              </w:rPr>
+              <w:t xml:space="preserve"> Dataset</w:t>
+            </w:r>
+          </w:p>
+          <w:p>
+            <w:pPr>
               <w:pStyle w:val="TableParagraph"/>
               <w:spacing w:before="214" w:line="429" w:lineRule="auto"/>
               <w:ind w:left="439" w:right="1078"/>
@@ -3836,6 +3972,19 @@
             <w:r>
               <w:rPr>
                 <w:sz w:val="24"/>
+                <w:szCs w:val="24"/>
+              </w:rPr>
+              <w:t>LiDAR equipped vehicle</w:t>
+            </w:r>
+            <w:r>
+              <w:rPr>
+                <w:sz w:val="24"/>
+              </w:rPr>
+              <w:br/>
+            </w:r>
+            <w:r>
+              <w:rPr>
+                <w:sz w:val="24"/>
               </w:rPr>
               <w:t>Existing System Architecture</w:t>
             </w:r>
@@ -3851,7 +4000,7 @@
                 <w:sz w:val="24"/>
                 <w:szCs w:val="24"/>
               </w:rPr>
-              <w:t>Environment Setup</w:t>
+              <w:t>Python Installation</w:t>
             </w:r>
           </w:p>
           <w:p>
@@ -3863,6 +4012,38 @@
                 <w:sz w:val="24"/>
               </w:rPr>
             </w:pPr>
+            <w:r>
+              <w:rPr>
+                <w:sz w:val="24"/>
+              </w:rPr>
+              <w:t>Setting up Anaconda Navigator</w:t>
+            </w:r>
+          </w:p>
+          <w:p>
+            <w:pPr>
+              <w:pStyle w:val="TableParagraph"/>
+              <w:spacing w:before="2" w:line="261" w:lineRule="exact"/>
+              <w:ind w:left="429"/>
+              <w:rPr>
+                <w:sz w:val="24"/>
+              </w:rPr>
+            </w:pPr>
+          </w:p>
+          <w:p>
+            <w:pPr>
+              <w:pStyle w:val="TableParagraph"/>
+              <w:spacing w:before="2" w:line="261" w:lineRule="exact"/>
+              <w:ind w:left="429"/>
+              <w:rPr>
+                <w:sz w:val="24"/>
+              </w:rPr>
+            </w:pPr>
+            <w:r>
+              <w:rPr>
+                <w:sz w:val="24"/>
+              </w:rPr>
+              <w:t>Drafting Code Base</w:t>
+            </w:r>
           </w:p>
         </w:tc>
         <w:tc>
@@ -3883,7 +4064,41 @@
               <w:rPr>
                 <w:sz w:val="24"/>
               </w:rPr>
-              <w:t>15</w:t>
+              <w:t>16</w:t>
+            </w:r>
+          </w:p>
+          <w:p>
+            <w:pPr>
+              <w:pStyle w:val="TableParagraph"/>
+              <w:spacing w:before="202"/>
+              <w:ind w:left="541"/>
+              <w:jc w:val="center"/>
+              <w:rPr>
+                <w:sz w:val="24"/>
+              </w:rPr>
+            </w:pPr>
+            <w:r>
+              <w:rPr>
+                <w:sz w:val="24"/>
+              </w:rPr>
+              <w:t>16</w:t>
+            </w:r>
+          </w:p>
+          <w:p>
+            <w:pPr>
+              <w:pStyle w:val="TableParagraph"/>
+              <w:spacing w:before="202"/>
+              <w:ind w:left="541"/>
+              <w:jc w:val="center"/>
+              <w:rPr>
+                <w:sz w:val="24"/>
+              </w:rPr>
+            </w:pPr>
+            <w:r>
+              <w:rPr>
+                <w:sz w:val="24"/>
+              </w:rPr>
+              <w:t>17</w:t>
             </w:r>
           </w:p>
           <w:p>
@@ -3900,7 +4115,13 @@
               <w:rPr>
                 <w:sz w:val="24"/>
               </w:rPr>
-              <w:t>23</w:t>
+              <w:t>2</w:t>
+            </w:r>
+            <w:r>
+              <w:rPr>
+                <w:sz w:val="24"/>
+              </w:rPr>
+              <w:t>2</w:t>
             </w:r>
           </w:p>
           <w:p>
@@ -3923,6 +4144,40 @@
                 <w:sz w:val="24"/>
               </w:rPr>
             </w:pPr>
+            <w:r>
+              <w:rPr>
+                <w:sz w:val="24"/>
+              </w:rPr>
+              <w:t>23</w:t>
+            </w:r>
+          </w:p>
+          <w:p>
+            <w:pPr>
+              <w:pStyle w:val="TableParagraph"/>
+              <w:spacing w:line="256" w:lineRule="exact"/>
+              <w:ind w:left="1330" w:right="804"/>
+              <w:jc w:val="center"/>
+              <w:rPr>
+                <w:sz w:val="24"/>
+              </w:rPr>
+            </w:pPr>
+          </w:p>
+          <w:p>
+            <w:pPr>
+              <w:pStyle w:val="TableParagraph"/>
+              <w:spacing w:line="256" w:lineRule="exact"/>
+              <w:ind w:left="1330" w:right="804"/>
+              <w:jc w:val="center"/>
+              <w:rPr>
+                <w:sz w:val="24"/>
+              </w:rPr>
+            </w:pPr>
+            <w:r>
+              <w:rPr>
+                <w:sz w:val="24"/>
+              </w:rPr>
+              <w:t>24</w:t>
+            </w:r>
           </w:p>
         </w:tc>
       </w:tr>
@@ -11265,6 +11520,41 @@
     <w:p>
       <w:pPr>
         <w:spacing w:after="0" w:line="240" w:lineRule="auto"/>
+        <w:ind w:left="360" w:firstLine="360"/>
+        <w:jc w:val="both"/>
+        <w:rPr>
+          <w:rFonts w:ascii="Times New Roman" w:hAnsi="Times New Roman"/>
+          <w:iCs/>
+          <w:sz w:val="24"/>
+          <w:szCs w:val="24"/>
+        </w:rPr>
+      </w:pPr>
+    </w:p>
+    <w:p>
+      <w:pPr>
+        <w:spacing w:after="0" w:line="240" w:lineRule="auto"/>
+        <w:ind w:left="360" w:firstLine="360"/>
+        <w:jc w:val="both"/>
+        <w:rPr>
+          <w:rFonts w:ascii="Times New Roman" w:hAnsi="Times New Roman"/>
+          <w:iCs/>
+          <w:sz w:val="24"/>
+          <w:szCs w:val="24"/>
+        </w:rPr>
+      </w:pPr>
+      <w:r>
+        <w:rPr>
+          <w:rFonts w:ascii="Times New Roman" w:hAnsi="Times New Roman"/>
+          <w:iCs/>
+          <w:sz w:val="24"/>
+          <w:szCs w:val="24"/>
+        </w:rPr>
+        <w:t>In addition to supporting proactive speed regulation and trajectory planning, the system improves navigation reliability under challenging road conditions such as low visibility, uneven terrain, and high-speed driving scenarios. By continuously analyzing road surface geometry, the perception module enables autonomous vehicles to anticipate hazards well in advance and respond smoothly rather than relying on reactive maneuvers. The wireframe representation of potholes allows navigation algorithms to compute safer paths that minimize abrupt steering or braking actions, thereby improving vehicle stability and passenger comfort. This capability is particularly beneficial in urban environments where road degradation is frequent and unpredictable.</w:t>
+      </w:r>
+    </w:p>
+    <w:p>
+      <w:pPr>
+        <w:spacing w:after="0" w:line="240" w:lineRule="auto"/>
         <w:ind w:left="360"/>
         <w:jc w:val="both"/>
         <w:rPr>
@@ -11343,6 +11633,41 @@
     <w:p>
       <w:pPr>
         <w:spacing w:after="0" w:line="240" w:lineRule="auto"/>
+        <w:ind w:left="360" w:firstLine="360"/>
+        <w:jc w:val="both"/>
+        <w:rPr>
+          <w:rFonts w:ascii="Times New Roman" w:hAnsi="Times New Roman"/>
+          <w:iCs/>
+          <w:sz w:val="24"/>
+          <w:szCs w:val="24"/>
+        </w:rPr>
+      </w:pPr>
+    </w:p>
+    <w:p>
+      <w:pPr>
+        <w:spacing w:after="0" w:line="240" w:lineRule="auto"/>
+        <w:ind w:left="360" w:firstLine="360"/>
+        <w:jc w:val="both"/>
+        <w:rPr>
+          <w:rFonts w:ascii="Times New Roman" w:hAnsi="Times New Roman"/>
+          <w:iCs/>
+          <w:sz w:val="24"/>
+          <w:szCs w:val="24"/>
+        </w:rPr>
+      </w:pPr>
+      <w:r>
+        <w:rPr>
+          <w:rFonts w:ascii="Times New Roman" w:hAnsi="Times New Roman"/>
+          <w:iCs/>
+          <w:sz w:val="24"/>
+          <w:szCs w:val="24"/>
+        </w:rPr>
+        <w:t>Beyond real-time vehicle operation, the system enables long-term infrastructure analysis by collecting structured road surface data across multiple trips and locations. The geometric attributes of detected potholes, such as depth and affected area, provide quantitative indicators of road deterioration severity. When aggregated over time, this information can be used to identify high-risk zones, monitor the progression of road damage, and prioritize maintenance efforts. Automated infrastructure monitoring using vision-based structural data significantly reduces inspection costs and enables data-driven decision-making for transportation authorities.</w:t>
+      </w:r>
+    </w:p>
+    <w:p>
+      <w:pPr>
+        <w:spacing w:after="0" w:line="240" w:lineRule="auto"/>
         <w:ind w:left="360"/>
         <w:jc w:val="both"/>
         <w:rPr>
@@ -11415,8 +11740,42 @@
           <w:sz w:val="24"/>
           <w:szCs w:val="24"/>
         </w:rPr>
-        <w:lastRenderedPageBreak/>
         <w:t>The system enhances safety by providing reliable, geometry-aware perception of road hazards. Decision support mechanisms use this information to trigger warnings, adjust driving behavior, or inform higher-level control systems. Accurate road surface perception directly contributes to safer and more resilient autonomous vehicle operation.</w:t>
+      </w:r>
+    </w:p>
+    <w:p>
+      <w:pPr>
+        <w:spacing w:after="0" w:line="240" w:lineRule="auto"/>
+        <w:ind w:left="360" w:firstLine="360"/>
+        <w:jc w:val="both"/>
+        <w:rPr>
+          <w:rFonts w:ascii="Times New Roman" w:hAnsi="Times New Roman"/>
+          <w:iCs/>
+          <w:sz w:val="24"/>
+          <w:szCs w:val="24"/>
+        </w:rPr>
+      </w:pPr>
+    </w:p>
+    <w:p>
+      <w:pPr>
+        <w:spacing w:after="0" w:line="240" w:lineRule="auto"/>
+        <w:ind w:left="360" w:firstLine="360"/>
+        <w:jc w:val="both"/>
+        <w:rPr>
+          <w:rFonts w:ascii="Times New Roman" w:hAnsi="Times New Roman"/>
+          <w:iCs/>
+          <w:sz w:val="24"/>
+          <w:szCs w:val="24"/>
+        </w:rPr>
+      </w:pPr>
+      <w:r>
+        <w:rPr>
+          <w:rFonts w:ascii="Times New Roman" w:hAnsi="Times New Roman"/>
+          <w:iCs/>
+          <w:sz w:val="24"/>
+          <w:szCs w:val="24"/>
+        </w:rPr>
+        <w:t>The system also serves as a critical input to higher-level safety and decision support frameworks within autonomous vehicles. Geometry-aware perception allows the system to assess hazard severity more accurately and differentiate between minor surface imperfections and critical road defects. Based on this assessment, appropriate safety actions such as warning generation, controlled deceleration, or rerouting can be initiated. The integration of structural road information into decision support systems enhances situational awareness and reduces the likelihood of unsafe maneuvers, contributing to more reliable and resilient autonomous vehicle operation.</w:t>
       </w:r>
     </w:p>
     <w:p>
@@ -16036,88 +16395,200 @@
     <w:p>
       <w:pPr>
         <w:spacing w:after="0" w:line="240" w:lineRule="auto"/>
-        <w:ind w:left="360"/>
-        <w:rPr>
-          <w:rFonts w:ascii="Times New Roman" w:hAnsi="Times New Roman"/>
-          <w:b/>
-          <w:bCs/>
-          <w:iCs/>
-          <w:sz w:val="24"/>
-          <w:szCs w:val="24"/>
-        </w:rPr>
-      </w:pPr>
-    </w:p>
-    <w:p>
-      <w:pPr>
-        <w:spacing w:after="0" w:line="240" w:lineRule="auto"/>
-        <w:ind w:left="360"/>
-        <w:rPr>
-          <w:rFonts w:ascii="Times New Roman" w:hAnsi="Times New Roman"/>
-          <w:b/>
-          <w:bCs/>
-          <w:iCs/>
-          <w:sz w:val="24"/>
-          <w:szCs w:val="24"/>
-        </w:rPr>
-      </w:pPr>
-    </w:p>
-    <w:p>
-      <w:pPr>
-        <w:spacing w:after="0" w:line="240" w:lineRule="auto"/>
-        <w:ind w:left="360"/>
-        <w:rPr>
-          <w:rFonts w:ascii="Times New Roman" w:hAnsi="Times New Roman"/>
-          <w:sz w:val="24"/>
-          <w:szCs w:val="24"/>
-        </w:rPr>
-      </w:pPr>
-      <w:r>
-        <w:rPr>
-          <w:rFonts w:ascii="Times New Roman" w:hAnsi="Times New Roman"/>
-          <w:b/>
-          <w:bCs/>
-          <w:sz w:val="24"/>
-          <w:szCs w:val="24"/>
-        </w:rPr>
-        <w:t>3.1.1</w:t>
-      </w:r>
-      <w:r>
-        <w:rPr>
-          <w:rFonts w:ascii="Times New Roman" w:hAnsi="Times New Roman"/>
-          <w:sz w:val="24"/>
-          <w:szCs w:val="24"/>
-        </w:rPr>
-        <w:t xml:space="preserve"> </w:t>
-      </w:r>
-      <w:r>
-        <w:rPr>
-          <w:rFonts w:ascii="Times New Roman" w:hAnsi="Times New Roman"/>
-          <w:b/>
-          <w:bCs/>
-          <w:sz w:val="24"/>
-          <w:szCs w:val="24"/>
-        </w:rPr>
-        <w:t>ISSUES IN THE SYSTEM</w:t>
-      </w:r>
-    </w:p>
-    <w:p>
-      <w:pPr>
-        <w:spacing w:after="0" w:line="240" w:lineRule="auto"/>
-        <w:ind w:left="360"/>
-        <w:rPr>
-          <w:rFonts w:ascii="Times New Roman" w:hAnsi="Times New Roman"/>
-          <w:sz w:val="24"/>
-          <w:szCs w:val="24"/>
-        </w:rPr>
-      </w:pPr>
-    </w:p>
-    <w:p>
-      <w:pPr>
-        <w:spacing w:after="0" w:line="240" w:lineRule="auto"/>
         <w:ind w:left="360" w:firstLine="360"/>
         <w:jc w:val="both"/>
         <w:rPr>
           <w:rFonts w:ascii="Times New Roman" w:hAnsi="Times New Roman"/>
+          <w:iCs/>
+          <w:sz w:val="24"/>
+          <w:szCs w:val="24"/>
+        </w:rPr>
+      </w:pPr>
+      <w:r>
+        <w:rPr>
+          <w:rFonts w:ascii="Times New Roman" w:hAnsi="Times New Roman"/>
+          <w:iCs/>
+          <w:sz w:val="24"/>
+          <w:szCs w:val="24"/>
+        </w:rPr>
+        <w:lastRenderedPageBreak/>
+        <w:drawing>
+          <wp:inline distT="0" distB="0" distL="0" distR="0" wp14:anchorId="5F321346" wp14:editId="1F1A4E3B">
+            <wp:extent cx="5734850" cy="1428949"/>
+            <wp:effectExtent l="0" t="0" r="0" b="0"/>
+            <wp:docPr id="648761138" name="Picture 1"/>
+            <wp:cNvGraphicFramePr>
+              <a:graphicFrameLocks xmlns:a="http://schemas.openxmlformats.org/drawingml/2006/main" noChangeAspect="1"/>
+            </wp:cNvGraphicFramePr>
+            <a:graphic xmlns:a="http://schemas.openxmlformats.org/drawingml/2006/main">
+              <a:graphicData uri="http://schemas.openxmlformats.org/drawingml/2006/picture">
+                <pic:pic xmlns:pic="http://schemas.openxmlformats.org/drawingml/2006/picture">
+                  <pic:nvPicPr>
+                    <pic:cNvPr id="648761138" name=""/>
+                    <pic:cNvPicPr/>
+                  </pic:nvPicPr>
+                  <pic:blipFill>
+                    <a:blip r:embed="rId10"/>
+                    <a:stretch>
+                      <a:fillRect/>
+                    </a:stretch>
+                  </pic:blipFill>
+                  <pic:spPr>
+                    <a:xfrm>
+                      <a:off x="0" y="0"/>
+                      <a:ext cx="5734850" cy="1428949"/>
+                    </a:xfrm>
+                    <a:prstGeom prst="rect">
+                      <a:avLst/>
+                    </a:prstGeom>
+                  </pic:spPr>
+                </pic:pic>
+              </a:graphicData>
+            </a:graphic>
+          </wp:inline>
+        </w:drawing>
+      </w:r>
+    </w:p>
+    <w:p>
+      <w:pPr>
+        <w:spacing w:after="0" w:line="240" w:lineRule="auto"/>
+        <w:ind w:left="360"/>
+        <w:jc w:val="center"/>
+        <w:rPr>
+          <w:rFonts w:ascii="Times New Roman" w:hAnsi="Times New Roman"/>
+          <w:b/>
+          <w:bCs/>
+          <w:iCs/>
+          <w:sz w:val="24"/>
+          <w:szCs w:val="24"/>
+        </w:rPr>
+      </w:pPr>
+    </w:p>
+    <w:p>
+      <w:pPr>
+        <w:spacing w:after="0" w:line="240" w:lineRule="auto"/>
+        <w:ind w:left="360"/>
+        <w:jc w:val="center"/>
+        <w:rPr>
+          <w:rFonts w:ascii="Times New Roman" w:hAnsi="Times New Roman"/>
+          <w:iCs/>
+          <w:sz w:val="24"/>
+          <w:szCs w:val="24"/>
+        </w:rPr>
+      </w:pPr>
+      <w:r>
+        <w:rPr>
+          <w:rFonts w:ascii="Times New Roman" w:hAnsi="Times New Roman"/>
+          <w:b/>
+          <w:bCs/>
+          <w:iCs/>
+          <w:sz w:val="24"/>
+          <w:szCs w:val="24"/>
+        </w:rPr>
+        <w:t xml:space="preserve">Figure 3.1 </w:t>
+      </w:r>
+      <w:r>
+        <w:rPr>
+          <w:rFonts w:ascii="Times New Roman" w:hAnsi="Times New Roman"/>
+          <w:iCs/>
+          <w:sz w:val="24"/>
+          <w:szCs w:val="24"/>
+        </w:rPr>
+        <w:t xml:space="preserve">Sample Images from </w:t>
+      </w:r>
+      <w:proofErr w:type="spellStart"/>
+      <w:r>
+        <w:rPr>
+          <w:rFonts w:ascii="Times New Roman" w:hAnsi="Times New Roman"/>
+          <w:iCs/>
+          <w:sz w:val="24"/>
+          <w:szCs w:val="24"/>
+        </w:rPr>
+        <w:t>PothRGB</w:t>
+      </w:r>
+      <w:proofErr w:type="spellEnd"/>
+      <w:r>
+        <w:rPr>
+          <w:rFonts w:ascii="Times New Roman" w:hAnsi="Times New Roman"/>
+          <w:iCs/>
+          <w:sz w:val="24"/>
+          <w:szCs w:val="24"/>
+        </w:rPr>
+        <w:t xml:space="preserve"> Dataset</w:t>
+      </w:r>
+    </w:p>
+    <w:p>
+      <w:pPr>
+        <w:spacing w:after="0" w:line="240" w:lineRule="auto"/>
+        <w:ind w:left="360"/>
+        <w:rPr>
+          <w:rFonts w:ascii="Times New Roman" w:hAnsi="Times New Roman"/>
+          <w:b/>
+          <w:bCs/>
+          <w:iCs/>
+          <w:sz w:val="24"/>
+          <w:szCs w:val="24"/>
+        </w:rPr>
+      </w:pPr>
+    </w:p>
+    <w:p>
+      <w:pPr>
+        <w:spacing w:after="0" w:line="240" w:lineRule="auto"/>
+        <w:ind w:left="360"/>
+        <w:rPr>
+          <w:rFonts w:ascii="Times New Roman" w:hAnsi="Times New Roman"/>
+          <w:sz w:val="24"/>
+          <w:szCs w:val="24"/>
+        </w:rPr>
+      </w:pPr>
+      <w:r>
+        <w:rPr>
+          <w:rFonts w:ascii="Times New Roman" w:hAnsi="Times New Roman"/>
+          <w:b/>
+          <w:bCs/>
+          <w:sz w:val="24"/>
+          <w:szCs w:val="24"/>
+        </w:rPr>
+        <w:t>3.1.1</w:t>
+      </w:r>
+      <w:r>
+        <w:rPr>
+          <w:rFonts w:ascii="Times New Roman" w:hAnsi="Times New Roman"/>
+          <w:sz w:val="24"/>
+          <w:szCs w:val="24"/>
+        </w:rPr>
+        <w:t xml:space="preserve"> </w:t>
+      </w:r>
+      <w:r>
+        <w:rPr>
+          <w:rFonts w:ascii="Times New Roman" w:hAnsi="Times New Roman"/>
+          <w:b/>
+          <w:bCs/>
+          <w:sz w:val="24"/>
+          <w:szCs w:val="24"/>
+        </w:rPr>
+        <w:t>ISSUES IN THE SYSTEM</w:t>
+      </w:r>
+    </w:p>
+    <w:p>
+      <w:pPr>
+        <w:spacing w:after="0" w:line="240" w:lineRule="auto"/>
+        <w:ind w:left="360"/>
+        <w:rPr>
+          <w:rFonts w:ascii="Times New Roman" w:hAnsi="Times New Roman"/>
+          <w:sz w:val="24"/>
+          <w:szCs w:val="24"/>
+        </w:rPr>
+      </w:pPr>
+    </w:p>
+    <w:p>
+      <w:pPr>
+        <w:spacing w:after="0" w:line="240" w:lineRule="auto"/>
+        <w:ind w:left="360" w:firstLine="360"/>
+        <w:jc w:val="both"/>
+        <w:rPr>
+          <w:rFonts w:ascii="Times New Roman" w:hAnsi="Times New Roman"/>
+          <w:iCs/>
           <w:sz w:val="24"/>
           <w:szCs w:val="24"/>
         </w:rPr>
@@ -16147,6 +16618,100 @@
           <w:szCs w:val="24"/>
         </w:rPr>
         <w:t>[1]</w:t>
+      </w:r>
+    </w:p>
+    <w:p>
+      <w:pPr>
+        <w:spacing w:after="0" w:line="240" w:lineRule="auto"/>
+        <w:ind w:left="360" w:firstLine="360"/>
+        <w:jc w:val="both"/>
+        <w:rPr>
+          <w:rFonts w:ascii="Times New Roman" w:hAnsi="Times New Roman"/>
+          <w:sz w:val="24"/>
+          <w:szCs w:val="24"/>
+        </w:rPr>
+      </w:pPr>
+      <w:r>
+        <w:rPr>
+          <w:rFonts w:ascii="Times New Roman" w:hAnsi="Times New Roman"/>
+          <w:sz w:val="24"/>
+          <w:szCs w:val="24"/>
+        </w:rPr>
+        <w:drawing>
+          <wp:inline distT="0" distB="0" distL="0" distR="0" wp14:anchorId="4FD24BD9" wp14:editId="5DA3FB3D">
+            <wp:extent cx="5429250" cy="2909521"/>
+            <wp:effectExtent l="0" t="0" r="0" b="5715"/>
+            <wp:docPr id="2145724930" name="Picture 1"/>
+            <wp:cNvGraphicFramePr>
+              <a:graphicFrameLocks xmlns:a="http://schemas.openxmlformats.org/drawingml/2006/main" noChangeAspect="1"/>
+            </wp:cNvGraphicFramePr>
+            <a:graphic xmlns:a="http://schemas.openxmlformats.org/drawingml/2006/main">
+              <a:graphicData uri="http://schemas.openxmlformats.org/drawingml/2006/picture">
+                <pic:pic xmlns:pic="http://schemas.openxmlformats.org/drawingml/2006/picture">
+                  <pic:nvPicPr>
+                    <pic:cNvPr id="2145724930" name=""/>
+                    <pic:cNvPicPr/>
+                  </pic:nvPicPr>
+                  <pic:blipFill>
+                    <a:blip r:embed="rId11"/>
+                    <a:stretch>
+                      <a:fillRect/>
+                    </a:stretch>
+                  </pic:blipFill>
+                  <pic:spPr>
+                    <a:xfrm>
+                      <a:off x="0" y="0"/>
+                      <a:ext cx="5436772" cy="2913552"/>
+                    </a:xfrm>
+                    <a:prstGeom prst="rect">
+                      <a:avLst/>
+                    </a:prstGeom>
+                  </pic:spPr>
+                </pic:pic>
+              </a:graphicData>
+            </a:graphic>
+          </wp:inline>
+        </w:drawing>
+      </w:r>
+    </w:p>
+    <w:p>
+      <w:pPr>
+        <w:spacing w:after="0" w:line="240" w:lineRule="auto"/>
+        <w:ind w:left="360" w:firstLine="360"/>
+        <w:jc w:val="center"/>
+        <w:rPr>
+          <w:rFonts w:ascii="Times New Roman" w:hAnsi="Times New Roman"/>
+          <w:sz w:val="24"/>
+          <w:szCs w:val="24"/>
+        </w:rPr>
+      </w:pPr>
+      <w:r>
+        <w:rPr>
+          <w:rFonts w:ascii="Times New Roman" w:hAnsi="Times New Roman"/>
+          <w:b/>
+          <w:bCs/>
+          <w:sz w:val="24"/>
+          <w:szCs w:val="24"/>
+        </w:rPr>
+        <w:t>Figure 3.1.1</w:t>
+      </w:r>
+      <w:r>
+        <w:rPr>
+          <w:rFonts w:ascii="Times New Roman" w:hAnsi="Times New Roman"/>
+          <w:b/>
+          <w:bCs/>
+          <w:sz w:val="24"/>
+          <w:szCs w:val="24"/>
+        </w:rPr>
+        <w:t xml:space="preserve"> </w:t>
+      </w:r>
+      <w:r>
+        <w:rPr>
+          <w:rFonts w:ascii="Times New Roman" w:hAnsi="Times New Roman"/>
+          <w:sz w:val="24"/>
+          <w:szCs w:val="24"/>
+        </w:rPr>
+        <w:t>LiDAR equipped vehicle</w:t>
       </w:r>
     </w:p>
     <w:p>
@@ -16245,7 +16810,7 @@
                     </pic:cNvPicPr>
                   </pic:nvPicPr>
                   <pic:blipFill>
-                    <a:blip r:embed="rId10" cstate="print">
+                    <a:blip r:embed="rId12" cstate="print">
                       <a:extLst>
                         <a:ext uri="{28A0092B-C50C-407E-A947-70E740481C1C}">
                           <a14:useLocalDpi xmlns:a14="http://schemas.microsoft.com/office/drawing/2010/main" val="0"/>
@@ -16432,7 +16997,16 @@
           <w:sz w:val="24"/>
           <w:szCs w:val="24"/>
         </w:rPr>
-        <w:t xml:space="preserve"> that eliminates the need for expensive depth sensors and complex sensor calibration. The system relies on a single RGB camera combined with deep learning–based vision models to perform accurate pothole detection, depth estimation, and structural modeling in real time. Instead of using LiDAR for depth extraction, the proposed approach employs monocular depth estimation techniques to infer relative depth information directly from visual input, enabling three-dimensional understanding of road surface anomalies without additional hardware. Detected potholes are further processed to generate a wireframe or geometric representation that captures boundary shape, depth variation, and spatial extent, providing continuous structural insight rather than discrete 2D bounding boxes. This lightweight perception pipeline is designed for low latency and reduced computational overhead, making it suitable for real-time autonomous navigation and scalable deployment. By focusing on structural understanding and real-time decision support, the proposed system addresses cost, scalability, and operational limitations of existing approaches while enabling proactive driving actions such as controlled deceleration and path adjustment.</w:t>
+        <w:t xml:space="preserve"> that eliminates the need for expensive depth sensors and complex sensor calibration. The system relies on a single RGB camera combined with deep learning–based vision models to perform accurate pothole detection, depth estimation, and structural modeling in real time. Instead of using LiDAR for depth extraction, the proposed approach employs monocular depth estimation techniques to infer relative depth information directly from visual input, enabling three-dimensional understanding of road surface anomalies without additional hardware. Detected potholes are further processed to generate a wireframe or geometric representation that captures boundary shape, depth variation, and spatial extent, providing continuous structural insight rather than discrete 2D bounding boxes. This lightweight perception pipeline is designed for low latency and reduced computational overhead, making it suitable for real-time autonomous navigation and scalable deployment. By focusing on structural understanding and real-time decision support, the proposed system </w:t>
+      </w:r>
+      <w:r>
+        <w:rPr>
+          <w:rFonts w:ascii="Times New Roman" w:hAnsi="Times New Roman"/>
+          <w:sz w:val="24"/>
+          <w:szCs w:val="24"/>
+        </w:rPr>
+        <w:lastRenderedPageBreak/>
+        <w:t>addresses cost, scalability, and operational limitations of existing approaches while enabling proactive driving actions such as controlled deceleration and path adjustment.</w:t>
       </w:r>
       <w:r>
         <w:rPr>
@@ -16811,7 +17385,6 @@
           <w:sz w:val="24"/>
           <w:szCs w:val="24"/>
         </w:rPr>
-        <w:lastRenderedPageBreak/>
         <w:t>Scalability and Cost Efficiency:</w:t>
       </w:r>
       <w:r>
@@ -18853,13 +19426,14 @@
           <w:b/>
           <w:bCs/>
           <w:iCs/>
+          <w:noProof/>
           <w:color w:val="000000" w:themeColor="text1"/>
           <w:sz w:val="24"/>
           <w:szCs w:val="24"/>
         </w:rPr>
         <w:drawing>
-          <wp:inline distT="0" distB="0" distL="0" distR="0" wp14:anchorId="0B6F46E6" wp14:editId="1B13D0B8">
-            <wp:extent cx="5943600" cy="3606800"/>
+          <wp:inline distT="0" distB="0" distL="0" distR="0" wp14:anchorId="0B6F46E6" wp14:editId="761AA7A4">
+            <wp:extent cx="5943600" cy="3200400"/>
             <wp:effectExtent l="0" t="0" r="0" b="0"/>
             <wp:docPr id="510013129" name="Picture 1"/>
             <wp:cNvGraphicFramePr>
@@ -18873,7 +19447,7 @@
                     <pic:cNvPicPr/>
                   </pic:nvPicPr>
                   <pic:blipFill>
-                    <a:blip r:embed="rId11"/>
+                    <a:blip r:embed="rId13"/>
                     <a:stretch>
                       <a:fillRect/>
                     </a:stretch>
@@ -18881,7 +19455,7 @@
                   <pic:spPr>
                     <a:xfrm>
                       <a:off x="0" y="0"/>
-                      <a:ext cx="5943600" cy="3606800"/>
+                      <a:ext cx="5943600" cy="3200400"/>
                     </a:xfrm>
                     <a:prstGeom prst="rect">
                       <a:avLst/>
@@ -18911,6 +19485,20 @@
     <w:p>
       <w:pPr>
         <w:spacing w:after="0" w:line="240" w:lineRule="auto"/>
+        <w:rPr>
+          <w:rFonts w:ascii="Times New Roman" w:hAnsi="Times New Roman"/>
+          <w:b/>
+          <w:bCs/>
+          <w:iCs/>
+          <w:color w:val="000000" w:themeColor="text1"/>
+          <w:sz w:val="24"/>
+          <w:szCs w:val="24"/>
+        </w:rPr>
+      </w:pPr>
+    </w:p>
+    <w:p>
+      <w:pPr>
+        <w:spacing w:after="0" w:line="240" w:lineRule="auto"/>
         <w:jc w:val="center"/>
         <w:rPr>
           <w:rFonts w:ascii="Times New Roman" w:hAnsi="Times New Roman"/>
@@ -18928,48 +19516,7 @@
           <w:b/>
           <w:bCs/>
           <w:iCs/>
-          <w:color w:val="000000" w:themeColor="text1"/>
-          <w:sz w:val="24"/>
-          <w:szCs w:val="24"/>
-        </w:rPr>
-        <w:t>Figure A1.1.1 Python Installation</w:t>
-      </w:r>
-    </w:p>
-    <w:p>
-      <w:pPr>
-        <w:spacing w:after="0" w:line="240" w:lineRule="auto"/>
-        <w:jc w:val="center"/>
-        <w:rPr>
-          <w:rFonts w:ascii="Times New Roman" w:hAnsi="Times New Roman"/>
-          <w:b/>
-          <w:bCs/>
-          <w:iCs/>
-          <w:color w:val="000000" w:themeColor="text1"/>
-          <w:sz w:val="24"/>
-          <w:szCs w:val="24"/>
-        </w:rPr>
-      </w:pPr>
-    </w:p>
-    <w:p>
-      <w:pPr>
-        <w:spacing w:after="0" w:line="240" w:lineRule="auto"/>
-        <w:jc w:val="center"/>
-        <w:rPr>
-          <w:rFonts w:ascii="Times New Roman" w:hAnsi="Times New Roman"/>
-          <w:b/>
-          <w:bCs/>
-          <w:iCs/>
-          <w:color w:val="000000" w:themeColor="text1"/>
-          <w:sz w:val="24"/>
-          <w:szCs w:val="24"/>
-        </w:rPr>
-      </w:pPr>
-      <w:r>
-        <w:rPr>
-          <w:rFonts w:ascii="Times New Roman" w:hAnsi="Times New Roman"/>
-          <w:b/>
-          <w:bCs/>
-          <w:iCs/>
+          <w:noProof/>
           <w:color w:val="000000" w:themeColor="text1"/>
           <w:sz w:val="24"/>
           <w:szCs w:val="24"/>
@@ -18990,7 +19537,7 @@
                     <pic:cNvPicPr/>
                   </pic:nvPicPr>
                   <pic:blipFill>
-                    <a:blip r:embed="rId12"/>
+                    <a:blip r:embed="rId14"/>
                     <a:stretch>
                       <a:fillRect/>
                     </a:stretch>
@@ -19029,6 +19576,20 @@
     <w:p>
       <w:pPr>
         <w:spacing w:after="0" w:line="240" w:lineRule="auto"/>
+        <w:rPr>
+          <w:rFonts w:ascii="Times New Roman" w:hAnsi="Times New Roman"/>
+          <w:b/>
+          <w:bCs/>
+          <w:iCs/>
+          <w:color w:val="000000" w:themeColor="text1"/>
+          <w:sz w:val="24"/>
+          <w:szCs w:val="24"/>
+        </w:rPr>
+      </w:pPr>
+    </w:p>
+    <w:p>
+      <w:pPr>
+        <w:spacing w:after="0" w:line="240" w:lineRule="auto"/>
         <w:jc w:val="center"/>
         <w:rPr>
           <w:rFonts w:ascii="Times New Roman" w:hAnsi="Times New Roman"/>
@@ -19040,7 +19601,11 @@
           <w:szCs w:val="24"/>
         </w:rPr>
       </w:pPr>
-      <w:r>
+    </w:p>
+    <w:p>
+      <w:pPr>
+        <w:spacing w:after="0" w:line="240" w:lineRule="auto"/>
+        <w:jc w:val="center"/>
         <w:rPr>
           <w:rFonts w:ascii="Times New Roman" w:hAnsi="Times New Roman"/>
           <w:b/>
@@ -19050,52 +19615,23 @@
           <w:sz w:val="24"/>
           <w:szCs w:val="24"/>
         </w:rPr>
-        <w:t>Figure A1.1.2 Python setup Progress</w:t>
-      </w:r>
-    </w:p>
-    <w:p>
-      <w:pPr>
-        <w:spacing w:after="0" w:line="240" w:lineRule="auto"/>
-        <w:jc w:val="center"/>
-        <w:rPr>
-          <w:rFonts w:ascii="Times New Roman" w:hAnsi="Times New Roman"/>
-          <w:b/>
-          <w:bCs/>
-          <w:iCs/>
+      </w:pPr>
+      <w:r>
+        <w:rPr>
+          <w:rFonts w:ascii="Times New Roman" w:hAnsi="Times New Roman"/>
+          <w:b/>
+          <w:bCs/>
+          <w:iCs/>
+          <w:noProof/>
           <w:color w:val="000000" w:themeColor="text1"/>
           <w:sz w:val="24"/>
           <w:szCs w:val="24"/>
         </w:rPr>
-      </w:pPr>
-    </w:p>
-    <w:p>
-      <w:pPr>
-        <w:spacing w:after="0" w:line="240" w:lineRule="auto"/>
-        <w:jc w:val="center"/>
-        <w:rPr>
-          <w:rFonts w:ascii="Times New Roman" w:hAnsi="Times New Roman"/>
-          <w:b/>
-          <w:bCs/>
-          <w:iCs/>
-          <w:color w:val="000000" w:themeColor="text1"/>
-          <w:sz w:val="24"/>
-          <w:szCs w:val="24"/>
-        </w:rPr>
-      </w:pPr>
-      <w:r>
-        <w:rPr>
-          <w:rFonts w:ascii="Times New Roman" w:hAnsi="Times New Roman"/>
-          <w:b/>
-          <w:bCs/>
-          <w:iCs/>
-          <w:color w:val="000000" w:themeColor="text1"/>
-          <w:sz w:val="24"/>
-          <w:szCs w:val="24"/>
-        </w:rPr>
+        <w:lastRenderedPageBreak/>
         <w:drawing>
-          <wp:inline distT="0" distB="0" distL="0" distR="0" wp14:anchorId="636E3ACA" wp14:editId="42F7FE9C">
-            <wp:extent cx="5943600" cy="3308350"/>
-            <wp:effectExtent l="0" t="0" r="0" b="6350"/>
+          <wp:inline distT="0" distB="0" distL="0" distR="0" wp14:anchorId="636E3ACA" wp14:editId="4238AE39">
+            <wp:extent cx="5943600" cy="3095625"/>
+            <wp:effectExtent l="0" t="0" r="0" b="9525"/>
             <wp:docPr id="15859215" name="Picture 1"/>
             <wp:cNvGraphicFramePr>
               <a:graphicFrameLocks xmlns:a="http://schemas.openxmlformats.org/drawingml/2006/main" noChangeAspect="1"/>
@@ -19108,7 +19644,7 @@
                     <pic:cNvPicPr/>
                   </pic:nvPicPr>
                   <pic:blipFill>
-                    <a:blip r:embed="rId13"/>
+                    <a:blip r:embed="rId15"/>
                     <a:stretch>
                       <a:fillRect/>
                     </a:stretch>
@@ -19116,7 +19652,7 @@
                   <pic:spPr>
                     <a:xfrm>
                       <a:off x="0" y="0"/>
-                      <a:ext cx="5943600" cy="3308350"/>
+                      <a:ext cx="5943600" cy="3095625"/>
                     </a:xfrm>
                     <a:prstGeom prst="rect">
                       <a:avLst/>
@@ -19168,26 +19704,23 @@
           <w:sz w:val="24"/>
           <w:szCs w:val="24"/>
         </w:rPr>
-        <w:t>Figure A1.1.3 Successful Installation of Python</w:t>
-      </w:r>
-    </w:p>
-    <w:p>
-      <w:pPr>
-        <w:spacing w:after="0" w:line="240" w:lineRule="auto"/>
-        <w:rPr>
-          <w:rFonts w:ascii="Times New Roman" w:hAnsi="Times New Roman"/>
-          <w:b/>
-          <w:bCs/>
+        <w:t xml:space="preserve">Figure A1.1.1 </w:t>
+      </w:r>
+      <w:r>
+        <w:rPr>
+          <w:rFonts w:ascii="Times New Roman" w:hAnsi="Times New Roman"/>
           <w:iCs/>
           <w:color w:val="000000" w:themeColor="text1"/>
           <w:sz w:val="24"/>
           <w:szCs w:val="24"/>
         </w:rPr>
-      </w:pPr>
-    </w:p>
-    <w:p>
-      <w:pPr>
-        <w:spacing w:after="0" w:line="240" w:lineRule="auto"/>
+        <w:t>Python Installation</w:t>
+      </w:r>
+    </w:p>
+    <w:p>
+      <w:pPr>
+        <w:spacing w:after="0" w:line="240" w:lineRule="auto"/>
+        <w:jc w:val="center"/>
         <w:rPr>
           <w:rFonts w:ascii="Times New Roman" w:hAnsi="Times New Roman"/>
           <w:b/>
@@ -19198,7 +19731,10 @@
           <w:szCs w:val="24"/>
         </w:rPr>
       </w:pPr>
-      <w:r>
+    </w:p>
+    <w:p>
+      <w:pPr>
+        <w:spacing w:after="0" w:line="240" w:lineRule="auto"/>
         <w:rPr>
           <w:rFonts w:ascii="Times New Roman" w:hAnsi="Times New Roman"/>
           <w:b/>
@@ -19208,8 +19744,7 @@
           <w:sz w:val="24"/>
           <w:szCs w:val="24"/>
         </w:rPr>
-        <w:t>A1.</w:t>
-      </w:r>
+      </w:pPr>
       <w:r>
         <w:rPr>
           <w:rFonts w:ascii="Times New Roman" w:hAnsi="Times New Roman"/>
@@ -19220,9 +19755,12 @@
           <w:sz w:val="24"/>
           <w:szCs w:val="24"/>
         </w:rPr>
-        <w:t>1</w:t>
-      </w:r>
-      <w:r>
+        <w:t>A1.1.2 SETTING UP ANACONDA NAVIGATOR</w:t>
+      </w:r>
+    </w:p>
+    <w:p>
+      <w:pPr>
+        <w:spacing w:after="0" w:line="240" w:lineRule="auto"/>
         <w:rPr>
           <w:rFonts w:ascii="Times New Roman" w:hAnsi="Times New Roman"/>
           <w:b/>
@@ -19232,9 +19770,12 @@
           <w:sz w:val="24"/>
           <w:szCs w:val="24"/>
         </w:rPr>
-        <w:t>.</w:t>
-      </w:r>
-      <w:r>
+      </w:pPr>
+    </w:p>
+    <w:p>
+      <w:pPr>
+        <w:spacing w:after="0" w:line="240" w:lineRule="auto"/>
+        <w:jc w:val="center"/>
         <w:rPr>
           <w:rFonts w:ascii="Times New Roman" w:hAnsi="Times New Roman"/>
           <w:b/>
@@ -19244,8 +19785,7 @@
           <w:sz w:val="24"/>
           <w:szCs w:val="24"/>
         </w:rPr>
-        <w:t>9</w:t>
-      </w:r>
+      </w:pPr>
       <w:r>
         <w:rPr>
           <w:rFonts w:ascii="Times New Roman" w:hAnsi="Times New Roman"/>
@@ -19256,19 +19796,102 @@
           <w:sz w:val="24"/>
           <w:szCs w:val="24"/>
         </w:rPr>
+        <w:drawing>
+          <wp:inline distT="0" distB="0" distL="0" distR="0" wp14:anchorId="6BB09910" wp14:editId="6C978AE3">
+            <wp:extent cx="5943600" cy="3848100"/>
+            <wp:effectExtent l="0" t="0" r="0" b="0"/>
+            <wp:docPr id="766180732" name="Picture 1"/>
+            <wp:cNvGraphicFramePr>
+              <a:graphicFrameLocks xmlns:a="http://schemas.openxmlformats.org/drawingml/2006/main" noChangeAspect="1"/>
+            </wp:cNvGraphicFramePr>
+            <a:graphic xmlns:a="http://schemas.openxmlformats.org/drawingml/2006/main">
+              <a:graphicData uri="http://schemas.openxmlformats.org/drawingml/2006/picture">
+                <pic:pic xmlns:pic="http://schemas.openxmlformats.org/drawingml/2006/picture">
+                  <pic:nvPicPr>
+                    <pic:cNvPr id="766180732" name=""/>
+                    <pic:cNvPicPr/>
+                  </pic:nvPicPr>
+                  <pic:blipFill>
+                    <a:blip r:embed="rId16"/>
+                    <a:stretch>
+                      <a:fillRect/>
+                    </a:stretch>
+                  </pic:blipFill>
+                  <pic:spPr>
+                    <a:xfrm>
+                      <a:off x="0" y="0"/>
+                      <a:ext cx="5943600" cy="3848100"/>
+                    </a:xfrm>
+                    <a:prstGeom prst="rect">
+                      <a:avLst/>
+                    </a:prstGeom>
+                  </pic:spPr>
+                </pic:pic>
+              </a:graphicData>
+            </a:graphic>
+          </wp:inline>
+        </w:drawing>
+      </w:r>
+    </w:p>
+    <w:p>
+      <w:pPr>
+        <w:spacing w:after="0" w:line="240" w:lineRule="auto"/>
+        <w:jc w:val="center"/>
+        <w:rPr>
+          <w:rFonts w:ascii="Times New Roman" w:hAnsi="Times New Roman"/>
+          <w:b/>
+          <w:bCs/>
+          <w:iCs/>
+          <w:color w:val="000000" w:themeColor="text1"/>
+          <w:sz w:val="24"/>
+          <w:szCs w:val="24"/>
+        </w:rPr>
+      </w:pPr>
+      <w:r>
+        <w:rPr>
+          <w:rFonts w:ascii="Times New Roman" w:hAnsi="Times New Roman"/>
+          <w:b/>
+          <w:bCs/>
+          <w:iCs/>
+          <w:color w:val="000000" w:themeColor="text1"/>
+          <w:sz w:val="24"/>
+          <w:szCs w:val="24"/>
+        </w:rPr>
+        <w:t>Figure A1.1.</w:t>
+      </w:r>
+      <w:r>
+        <w:rPr>
+          <w:rFonts w:ascii="Times New Roman" w:hAnsi="Times New Roman"/>
+          <w:b/>
+          <w:bCs/>
+          <w:iCs/>
+          <w:color w:val="000000" w:themeColor="text1"/>
+          <w:sz w:val="24"/>
+          <w:szCs w:val="24"/>
+        </w:rPr>
+        <w:t>2</w:t>
+      </w:r>
+      <w:r>
+        <w:rPr>
+          <w:rFonts w:ascii="Times New Roman" w:hAnsi="Times New Roman"/>
+          <w:b/>
+          <w:bCs/>
+          <w:iCs/>
+          <w:color w:val="000000" w:themeColor="text1"/>
+          <w:sz w:val="24"/>
+          <w:szCs w:val="24"/>
+        </w:rPr>
         <w:t xml:space="preserve"> </w:t>
       </w:r>
       <w:r>
         <w:rPr>
           <w:rFonts w:ascii="Times New Roman" w:hAnsi="Times New Roman"/>
-          <w:b/>
-          <w:bCs/>
           <w:iCs/>
           <w:color w:val="000000" w:themeColor="text1"/>
           <w:sz w:val="24"/>
           <w:szCs w:val="24"/>
         </w:rPr>
-        <w:t>PYTHON PROGRAM</w:t>
+        <w:t>Setting up Anaconda Navigator</w:t>
       </w:r>
     </w:p>
     <w:p>
@@ -19301,10 +19924,11 @@
         <w:rPr>
           <w:noProof/>
         </w:rPr>
+        <w:lastRenderedPageBreak/>
         <w:drawing>
-          <wp:inline distT="0" distB="0" distL="0" distR="0" wp14:anchorId="24EF1054" wp14:editId="3EEF7559">
-            <wp:extent cx="5943600" cy="3509010"/>
-            <wp:effectExtent l="0" t="0" r="0" b="0"/>
+          <wp:inline distT="0" distB="0" distL="0" distR="0" wp14:anchorId="24EF1054" wp14:editId="5ABEB9BB">
+            <wp:extent cx="5943600" cy="3419475"/>
+            <wp:effectExtent l="0" t="0" r="0" b="9525"/>
             <wp:docPr id="7" name="Picture 6">
               <a:extLst xmlns:a="http://schemas.openxmlformats.org/drawingml/2006/main">
                 <a:ext uri="{FF2B5EF4-FFF2-40B4-BE49-F238E27FC236}">
@@ -19331,7 +19955,7 @@
                     </pic:cNvPicPr>
                   </pic:nvPicPr>
                   <pic:blipFill>
-                    <a:blip r:embed="rId14" cstate="print">
+                    <a:blip r:embed="rId17" cstate="print">
                       <a:extLst>
                         <a:ext uri="{28A0092B-C50C-407E-A947-70E740481C1C}">
                           <a14:useLocalDpi xmlns:a14="http://schemas.microsoft.com/office/drawing/2010/main" val="0"/>
@@ -19345,7 +19969,7 @@
                   <pic:spPr>
                     <a:xfrm>
                       <a:off x="0" y="0"/>
-                      <a:ext cx="5943600" cy="3509010"/>
+                      <a:ext cx="5943600" cy="3419475"/>
                     </a:xfrm>
                     <a:prstGeom prst="rect">
                       <a:avLst/>
@@ -19393,16 +20017,58 @@
           <w:sz w:val="24"/>
           <w:szCs w:val="24"/>
         </w:rPr>
-        <w:t xml:space="preserve">Figure A1.1.1 </w:t>
-      </w:r>
-      <w:r>
-        <w:rPr>
-          <w:rFonts w:ascii="Times New Roman" w:hAnsi="Times New Roman"/>
-          <w:iCs/>
-          <w:sz w:val="24"/>
-          <w:szCs w:val="24"/>
-        </w:rPr>
-        <w:t>Environment Setup</w:t>
+        <w:t>Figure A1.1.</w:t>
+      </w:r>
+      <w:r>
+        <w:rPr>
+          <w:rFonts w:ascii="Times New Roman" w:hAnsi="Times New Roman"/>
+          <w:b/>
+          <w:bCs/>
+          <w:iCs/>
+          <w:sz w:val="24"/>
+          <w:szCs w:val="24"/>
+        </w:rPr>
+        <w:t>3</w:t>
+      </w:r>
+      <w:r>
+        <w:rPr>
+          <w:rFonts w:ascii="Times New Roman" w:hAnsi="Times New Roman"/>
+          <w:b/>
+          <w:bCs/>
+          <w:iCs/>
+          <w:sz w:val="24"/>
+          <w:szCs w:val="24"/>
+        </w:rPr>
+        <w:t xml:space="preserve"> </w:t>
+      </w:r>
+      <w:r>
+        <w:rPr>
+          <w:rFonts w:ascii="Times New Roman" w:hAnsi="Times New Roman"/>
+          <w:iCs/>
+          <w:sz w:val="24"/>
+          <w:szCs w:val="24"/>
+        </w:rPr>
+        <w:t>Drafting Code base</w:t>
+      </w:r>
+    </w:p>
+    <w:p>
+      <w:pPr>
+        <w:spacing w:after="0" w:line="240" w:lineRule="auto"/>
+        <w:rPr>
+          <w:rFonts w:ascii="Times New Roman" w:hAnsi="Times New Roman"/>
+          <w:iCs/>
+          <w:sz w:val="24"/>
+          <w:szCs w:val="24"/>
+        </w:rPr>
+      </w:pPr>
+      <w:r>
+        <w:rPr>
+          <w:rFonts w:ascii="Times New Roman" w:hAnsi="Times New Roman"/>
+          <w:iCs/>
+          <w:sz w:val="24"/>
+          <w:szCs w:val="24"/>
+        </w:rPr>
+        <w:br w:type="page"/>
       </w:r>
     </w:p>
     <w:p>
@@ -19413,6 +20079,20 @@
         <w:jc w:val="center"/>
         <w:rPr>
           <w:rFonts w:ascii="Times New Roman" w:hAnsi="Times New Roman"/>
+          <w:iCs/>
+          <w:sz w:val="24"/>
+          <w:szCs w:val="24"/>
+        </w:rPr>
+      </w:pPr>
+    </w:p>
+    <w:p>
+      <w:pPr>
+        <w:pStyle w:val="ListParagraph"/>
+        <w:spacing w:after="0" w:line="240" w:lineRule="auto"/>
+        <w:ind w:left="360"/>
+        <w:jc w:val="center"/>
+        <w:rPr>
+          <w:rFonts w:ascii="Times New Roman" w:hAnsi="Times New Roman"/>
           <w:b/>
           <w:bCs/>
           <w:iCs/>
@@ -19429,7 +20109,6 @@
           <w:sz w:val="28"/>
           <w:szCs w:val="28"/>
         </w:rPr>
-        <w:lastRenderedPageBreak/>
         <w:t>REFERENCES</w:t>
       </w:r>
     </w:p>
@@ -19450,31 +20129,1164 @@
     <w:p>
       <w:pPr>
         <w:pStyle w:val="ListParagraph"/>
-        <w:spacing w:after="0" w:line="240" w:lineRule="auto"/>
-        <w:ind w:left="0"/>
-        <w:jc w:val="center"/>
-        <w:rPr>
-          <w:rFonts w:ascii="Times New Roman" w:hAnsi="Times New Roman"/>
-          <w:b/>
-          <w:bCs/>
-          <w:iCs/>
-          <w:color w:val="EE0000"/>
-          <w:sz w:val="28"/>
-          <w:szCs w:val="28"/>
-        </w:rPr>
-      </w:pPr>
-      <w:r>
-        <w:rPr>
-          <w:rFonts w:ascii="Times New Roman" w:hAnsi="Times New Roman"/>
-          <w:b/>
-          <w:bCs/>
-          <w:iCs/>
-          <w:color w:val="EE0000"/>
-          <w:sz w:val="28"/>
-          <w:szCs w:val="28"/>
-        </w:rPr>
-        <w:t>(fix references and add more references)</w:t>
-      </w:r>
+        <w:spacing w:line="240" w:lineRule="auto"/>
+        <w:jc w:val="both"/>
+        <w:rPr>
+          <w:rFonts w:ascii="Times New Roman" w:hAnsi="Times New Roman"/>
+          <w:sz w:val="24"/>
+          <w:szCs w:val="24"/>
+        </w:rPr>
+      </w:pPr>
+      <w:r>
+        <w:rPr>
+          <w:rFonts w:ascii="Times New Roman" w:hAnsi="Times New Roman"/>
+          <w:sz w:val="24"/>
+          <w:szCs w:val="24"/>
+        </w:rPr>
+        <w:t xml:space="preserve">[1] </w:t>
+      </w:r>
+      <w:r>
+        <w:rPr>
+          <w:rFonts w:ascii="Times New Roman" w:hAnsi="Times New Roman"/>
+          <w:sz w:val="24"/>
+          <w:szCs w:val="24"/>
+        </w:rPr>
+        <w:t xml:space="preserve">A. </w:t>
+      </w:r>
+      <w:proofErr w:type="spellStart"/>
+      <w:r>
+        <w:rPr>
+          <w:rFonts w:ascii="Times New Roman" w:hAnsi="Times New Roman"/>
+          <w:sz w:val="24"/>
+          <w:szCs w:val="24"/>
+        </w:rPr>
+        <w:t>Karukayil</w:t>
+      </w:r>
+      <w:proofErr w:type="spellEnd"/>
+      <w:r>
+        <w:rPr>
+          <w:rFonts w:ascii="Times New Roman" w:hAnsi="Times New Roman"/>
+          <w:sz w:val="24"/>
+          <w:szCs w:val="24"/>
+        </w:rPr>
+        <w:t xml:space="preserve">, C. Quail, and F. A. </w:t>
+      </w:r>
+      <w:proofErr w:type="spellStart"/>
+      <w:r>
+        <w:rPr>
+          <w:rFonts w:ascii="Times New Roman" w:hAnsi="Times New Roman"/>
+          <w:sz w:val="24"/>
+          <w:szCs w:val="24"/>
+        </w:rPr>
+        <w:t>Cheein</w:t>
+      </w:r>
+      <w:proofErr w:type="spellEnd"/>
+      <w:r>
+        <w:rPr>
+          <w:rFonts w:ascii="Times New Roman" w:hAnsi="Times New Roman"/>
+          <w:sz w:val="24"/>
+          <w:szCs w:val="24"/>
+        </w:rPr>
+        <w:t xml:space="preserve">, “Deep learning enhanced feature extraction of potholes using vision and LiDAR data for road maintenance,” </w:t>
+      </w:r>
+      <w:r>
+        <w:rPr>
+          <w:rFonts w:ascii="Times New Roman" w:hAnsi="Times New Roman"/>
+          <w:i/>
+          <w:iCs/>
+          <w:sz w:val="24"/>
+          <w:szCs w:val="24"/>
+        </w:rPr>
+        <w:t>IEEE Access</w:t>
+      </w:r>
+      <w:r>
+        <w:rPr>
+          <w:rFonts w:ascii="Times New Roman" w:hAnsi="Times New Roman"/>
+          <w:sz w:val="24"/>
+          <w:szCs w:val="24"/>
+        </w:rPr>
+        <w:t>, vol. 12, pp. 1–14, 2024.</w:t>
+      </w:r>
+    </w:p>
+    <w:p>
+      <w:pPr>
+        <w:pStyle w:val="ListParagraph"/>
+        <w:spacing w:line="240" w:lineRule="auto"/>
+        <w:jc w:val="both"/>
+      </w:pPr>
+    </w:p>
+    <w:p>
+      <w:pPr>
+        <w:pStyle w:val="ListParagraph"/>
+        <w:jc w:val="both"/>
+        <w:rPr>
+          <w:rFonts w:ascii="Times New Roman" w:hAnsi="Times New Roman"/>
+          <w:iCs/>
+          <w:color w:val="000000" w:themeColor="text1"/>
+          <w:sz w:val="24"/>
+          <w:szCs w:val="24"/>
+        </w:rPr>
+      </w:pPr>
+      <w:r>
+        <w:rPr>
+          <w:rFonts w:ascii="Times New Roman" w:hAnsi="Times New Roman"/>
+          <w:iCs/>
+          <w:color w:val="000000" w:themeColor="text1"/>
+          <w:sz w:val="24"/>
+          <w:szCs w:val="24"/>
+        </w:rPr>
+        <w:t>[</w:t>
+      </w:r>
+      <w:r>
+        <w:rPr>
+          <w:rFonts w:ascii="Times New Roman" w:hAnsi="Times New Roman"/>
+          <w:iCs/>
+          <w:color w:val="000000" w:themeColor="text1"/>
+          <w:sz w:val="24"/>
+          <w:szCs w:val="24"/>
+        </w:rPr>
+        <w:t>2</w:t>
+      </w:r>
+      <w:r>
+        <w:rPr>
+          <w:rFonts w:ascii="Times New Roman" w:hAnsi="Times New Roman"/>
+          <w:iCs/>
+          <w:color w:val="000000" w:themeColor="text1"/>
+          <w:sz w:val="24"/>
+          <w:szCs w:val="24"/>
+        </w:rPr>
+        <w:t>]</w:t>
+      </w:r>
+      <w:r>
+        <w:t xml:space="preserve"> </w:t>
+      </w:r>
+      <w:r>
+        <w:rPr>
+          <w:rFonts w:ascii="Times New Roman" w:hAnsi="Times New Roman"/>
+          <w:iCs/>
+          <w:color w:val="000000" w:themeColor="text1"/>
+          <w:sz w:val="24"/>
+          <w:szCs w:val="24"/>
+        </w:rPr>
+        <w:t>Mustafa</w:t>
+      </w:r>
+      <w:r>
+        <w:rPr>
+          <w:rFonts w:ascii="Times New Roman" w:hAnsi="Times New Roman"/>
+          <w:iCs/>
+          <w:color w:val="000000" w:themeColor="text1"/>
+          <w:sz w:val="24"/>
+          <w:szCs w:val="24"/>
+        </w:rPr>
+        <w:t>”</w:t>
+      </w:r>
+      <w:r>
+        <w:rPr>
+          <w:rFonts w:ascii="Times New Roman" w:hAnsi="Times New Roman"/>
+          <w:iCs/>
+          <w:color w:val="000000" w:themeColor="text1"/>
+          <w:sz w:val="24"/>
+          <w:szCs w:val="24"/>
+        </w:rPr>
+        <w:t xml:space="preserve"> Yurdakul, </w:t>
+      </w:r>
+      <w:proofErr w:type="spellStart"/>
+      <w:r>
+        <w:rPr>
+          <w:rFonts w:ascii="Times New Roman" w:hAnsi="Times New Roman"/>
+          <w:iCs/>
+          <w:color w:val="000000" w:themeColor="text1"/>
+          <w:sz w:val="24"/>
+          <w:szCs w:val="24"/>
+        </w:rPr>
+        <w:t>Şakir</w:t>
+      </w:r>
+      <w:proofErr w:type="spellEnd"/>
+      <w:r>
+        <w:rPr>
+          <w:rFonts w:ascii="Times New Roman" w:hAnsi="Times New Roman"/>
+          <w:iCs/>
+          <w:color w:val="000000" w:themeColor="text1"/>
+          <w:sz w:val="24"/>
+          <w:szCs w:val="24"/>
+        </w:rPr>
+        <w:t xml:space="preserve"> Taşdemir</w:t>
+      </w:r>
+      <w:r>
+        <w:t>, “</w:t>
+      </w:r>
+      <w:r>
+        <w:rPr>
+          <w:rFonts w:ascii="Times New Roman" w:hAnsi="Times New Roman"/>
+          <w:iCs/>
+          <w:color w:val="000000" w:themeColor="text1"/>
+          <w:sz w:val="24"/>
+          <w:szCs w:val="24"/>
+        </w:rPr>
+        <w:t xml:space="preserve">An Enhanced YOLOv8 Model for Real-Time and Accurate Pothole Detection and Measurement </w:t>
+      </w:r>
+      <w:r>
+        <w:rPr>
+          <w:rFonts w:ascii="Times New Roman" w:hAnsi="Times New Roman"/>
+          <w:iCs/>
+          <w:color w:val="000000" w:themeColor="text1"/>
+          <w:sz w:val="24"/>
+          <w:szCs w:val="24"/>
+        </w:rPr>
+        <w:t>“</w:t>
+      </w:r>
+    </w:p>
+    <w:p>
+      <w:pPr>
+        <w:pStyle w:val="ListParagraph"/>
+        <w:jc w:val="both"/>
+        <w:rPr>
+          <w:rFonts w:ascii="Times New Roman" w:hAnsi="Times New Roman"/>
+          <w:iCs/>
+          <w:color w:val="000000" w:themeColor="text1"/>
+          <w:sz w:val="24"/>
+          <w:szCs w:val="24"/>
+        </w:rPr>
+      </w:pPr>
+    </w:p>
+    <w:p>
+      <w:pPr>
+        <w:pStyle w:val="ListParagraph"/>
+        <w:jc w:val="both"/>
+        <w:rPr>
+          <w:rFonts w:ascii="Times New Roman" w:hAnsi="Times New Roman"/>
+          <w:iCs/>
+          <w:color w:val="000000" w:themeColor="text1"/>
+          <w:sz w:val="24"/>
+          <w:szCs w:val="24"/>
+        </w:rPr>
+      </w:pPr>
+      <w:r>
+        <w:rPr>
+          <w:rFonts w:ascii="Times New Roman" w:hAnsi="Times New Roman"/>
+          <w:iCs/>
+          <w:color w:val="000000" w:themeColor="text1"/>
+          <w:sz w:val="24"/>
+          <w:szCs w:val="24"/>
+        </w:rPr>
+        <w:t>[</w:t>
+      </w:r>
+      <w:r>
+        <w:rPr>
+          <w:rFonts w:ascii="Times New Roman" w:hAnsi="Times New Roman"/>
+          <w:iCs/>
+          <w:color w:val="000000" w:themeColor="text1"/>
+          <w:sz w:val="24"/>
+          <w:szCs w:val="24"/>
+        </w:rPr>
+        <w:t>3</w:t>
+      </w:r>
+      <w:r>
+        <w:rPr>
+          <w:rFonts w:ascii="Times New Roman" w:hAnsi="Times New Roman"/>
+          <w:iCs/>
+          <w:color w:val="000000" w:themeColor="text1"/>
+          <w:sz w:val="24"/>
+          <w:szCs w:val="24"/>
+        </w:rPr>
+        <w:t xml:space="preserve">] </w:t>
+      </w:r>
+      <w:proofErr w:type="spellStart"/>
+      <w:r>
+        <w:rPr>
+          <w:rFonts w:ascii="Times New Roman" w:hAnsi="Times New Roman"/>
+          <w:iCs/>
+          <w:color w:val="000000" w:themeColor="text1"/>
+          <w:sz w:val="24"/>
+          <w:szCs w:val="24"/>
+        </w:rPr>
+        <w:t>Dehao</w:t>
+      </w:r>
+      <w:proofErr w:type="spellEnd"/>
+      <w:r>
+        <w:rPr>
+          <w:rFonts w:ascii="Times New Roman" w:hAnsi="Times New Roman"/>
+          <w:iCs/>
+          <w:color w:val="000000" w:themeColor="text1"/>
+          <w:sz w:val="24"/>
+          <w:szCs w:val="24"/>
+        </w:rPr>
+        <w:t xml:space="preserve"> Wang, </w:t>
+      </w:r>
+      <w:proofErr w:type="spellStart"/>
+      <w:r>
+        <w:rPr>
+          <w:rFonts w:ascii="Times New Roman" w:hAnsi="Times New Roman"/>
+          <w:iCs/>
+          <w:color w:val="000000" w:themeColor="text1"/>
+          <w:sz w:val="24"/>
+          <w:szCs w:val="24"/>
+        </w:rPr>
+        <w:t>Haohang</w:t>
+      </w:r>
+      <w:proofErr w:type="spellEnd"/>
+      <w:r>
+        <w:rPr>
+          <w:rFonts w:ascii="Times New Roman" w:hAnsi="Times New Roman"/>
+          <w:iCs/>
+          <w:color w:val="000000" w:themeColor="text1"/>
+          <w:sz w:val="24"/>
+          <w:szCs w:val="24"/>
+        </w:rPr>
+        <w:t xml:space="preserve"> Zhu, Yiwen Xu, and </w:t>
+      </w:r>
+      <w:proofErr w:type="spellStart"/>
+      <w:r>
+        <w:rPr>
+          <w:rFonts w:ascii="Times New Roman" w:hAnsi="Times New Roman"/>
+          <w:iCs/>
+          <w:color w:val="000000" w:themeColor="text1"/>
+          <w:sz w:val="24"/>
+          <w:szCs w:val="24"/>
+        </w:rPr>
+        <w:t>Kaiqi</w:t>
+      </w:r>
+      <w:proofErr w:type="spellEnd"/>
+      <w:r>
+        <w:rPr>
+          <w:rFonts w:ascii="Times New Roman" w:hAnsi="Times New Roman"/>
+          <w:iCs/>
+          <w:color w:val="000000" w:themeColor="text1"/>
+          <w:sz w:val="24"/>
+          <w:szCs w:val="24"/>
+        </w:rPr>
+        <w:t xml:space="preserve"> </w:t>
+      </w:r>
+      <w:proofErr w:type="gramStart"/>
+      <w:r>
+        <w:rPr>
+          <w:rFonts w:ascii="Times New Roman" w:hAnsi="Times New Roman"/>
+          <w:iCs/>
+          <w:color w:val="000000" w:themeColor="text1"/>
+          <w:sz w:val="24"/>
+          <w:szCs w:val="24"/>
+        </w:rPr>
+        <w:t>Liu</w:t>
+      </w:r>
+      <w:r>
+        <w:rPr>
+          <w:rFonts w:ascii="Times New Roman" w:hAnsi="Times New Roman"/>
+          <w:iCs/>
+          <w:color w:val="000000" w:themeColor="text1"/>
+          <w:sz w:val="24"/>
+          <w:szCs w:val="24"/>
+        </w:rPr>
+        <w:t xml:space="preserve">, </w:t>
+      </w:r>
+      <w:r>
+        <w:t xml:space="preserve"> </w:t>
+      </w:r>
+      <w:r>
+        <w:t>“</w:t>
+      </w:r>
+      <w:proofErr w:type="gramEnd"/>
+      <w:r>
+        <w:rPr>
+          <w:rFonts w:ascii="Times New Roman" w:hAnsi="Times New Roman"/>
+          <w:iCs/>
+          <w:color w:val="000000" w:themeColor="text1"/>
+          <w:sz w:val="24"/>
+          <w:szCs w:val="24"/>
+        </w:rPr>
+        <w:t>Robust Video-Based Pothole Detection and Area Estimation for Intelligent Vehicles with Depth Map and Kalman Smoothing</w:t>
+      </w:r>
+      <w:r>
+        <w:rPr>
+          <w:rFonts w:ascii="Times New Roman" w:hAnsi="Times New Roman"/>
+          <w:iCs/>
+          <w:color w:val="000000" w:themeColor="text1"/>
+          <w:sz w:val="24"/>
+          <w:szCs w:val="24"/>
+        </w:rPr>
+        <w:t xml:space="preserve">”, </w:t>
+      </w:r>
+      <w:r>
+        <w:rPr>
+          <w:rFonts w:ascii="Times New Roman" w:hAnsi="Times New Roman"/>
+          <w:iCs/>
+          <w:color w:val="000000" w:themeColor="text1"/>
+          <w:sz w:val="24"/>
+          <w:szCs w:val="24"/>
+        </w:rPr>
+        <w:t xml:space="preserve">Journal </w:t>
+      </w:r>
+      <w:proofErr w:type="gramStart"/>
+      <w:r>
+        <w:rPr>
+          <w:rFonts w:ascii="Times New Roman" w:hAnsi="Times New Roman"/>
+          <w:iCs/>
+          <w:color w:val="000000" w:themeColor="text1"/>
+          <w:sz w:val="24"/>
+          <w:szCs w:val="24"/>
+        </w:rPr>
+        <w:t>Of</w:t>
+      </w:r>
+      <w:proofErr w:type="gramEnd"/>
+      <w:r>
+        <w:rPr>
+          <w:rFonts w:ascii="Times New Roman" w:hAnsi="Times New Roman"/>
+          <w:iCs/>
+          <w:color w:val="000000" w:themeColor="text1"/>
+          <w:sz w:val="24"/>
+          <w:szCs w:val="24"/>
+        </w:rPr>
+        <w:t xml:space="preserve"> Latex Class Files, Vol. 14, No. 8, August 2021</w:t>
+      </w:r>
+    </w:p>
+    <w:p>
+      <w:pPr>
+        <w:pStyle w:val="ListParagraph"/>
+        <w:jc w:val="both"/>
+        <w:rPr>
+          <w:rFonts w:ascii="Times New Roman" w:hAnsi="Times New Roman"/>
+          <w:iCs/>
+          <w:color w:val="000000" w:themeColor="text1"/>
+          <w:sz w:val="24"/>
+          <w:szCs w:val="24"/>
+        </w:rPr>
+      </w:pPr>
+    </w:p>
+    <w:p>
+      <w:pPr>
+        <w:pStyle w:val="ListParagraph"/>
+        <w:jc w:val="both"/>
+        <w:rPr>
+          <w:rFonts w:ascii="Times New Roman" w:hAnsi="Times New Roman"/>
+          <w:iCs/>
+          <w:color w:val="000000" w:themeColor="text1"/>
+          <w:sz w:val="24"/>
+          <w:szCs w:val="24"/>
+        </w:rPr>
+      </w:pPr>
+      <w:r>
+        <w:rPr>
+          <w:rFonts w:ascii="Times New Roman" w:hAnsi="Times New Roman"/>
+          <w:iCs/>
+          <w:color w:val="000000" w:themeColor="text1"/>
+          <w:sz w:val="24"/>
+          <w:szCs w:val="24"/>
+        </w:rPr>
+        <w:t>[</w:t>
+      </w:r>
+      <w:r>
+        <w:rPr>
+          <w:rFonts w:ascii="Times New Roman" w:hAnsi="Times New Roman"/>
+          <w:iCs/>
+          <w:color w:val="000000" w:themeColor="text1"/>
+          <w:sz w:val="24"/>
+          <w:szCs w:val="24"/>
+        </w:rPr>
+        <w:t>4</w:t>
+      </w:r>
+      <w:r>
+        <w:rPr>
+          <w:rFonts w:ascii="Times New Roman" w:hAnsi="Times New Roman"/>
+          <w:iCs/>
+          <w:color w:val="000000" w:themeColor="text1"/>
+          <w:sz w:val="24"/>
+          <w:szCs w:val="24"/>
+        </w:rPr>
+        <w:t>]</w:t>
+      </w:r>
+      <w:r>
+        <w:rPr>
+          <w:rFonts w:ascii="Times New Roman" w:hAnsi="Times New Roman"/>
+          <w:iCs/>
+          <w:color w:val="000000" w:themeColor="text1"/>
+          <w:sz w:val="24"/>
+          <w:szCs w:val="24"/>
+        </w:rPr>
+        <w:t xml:space="preserve"> </w:t>
+      </w:r>
+      <w:proofErr w:type="spellStart"/>
+      <w:r>
+        <w:rPr>
+          <w:rFonts w:ascii="Times New Roman" w:hAnsi="Times New Roman"/>
+          <w:iCs/>
+          <w:color w:val="000000" w:themeColor="text1"/>
+          <w:sz w:val="24"/>
+          <w:szCs w:val="24"/>
+        </w:rPr>
+        <w:t>Xingbin</w:t>
+      </w:r>
+      <w:proofErr w:type="spellEnd"/>
+      <w:r>
+        <w:rPr>
+          <w:rFonts w:ascii="Times New Roman" w:hAnsi="Times New Roman"/>
+          <w:iCs/>
+          <w:color w:val="000000" w:themeColor="text1"/>
+          <w:sz w:val="24"/>
+          <w:szCs w:val="24"/>
+        </w:rPr>
+        <w:t xml:space="preserve"> Yang, </w:t>
+      </w:r>
+      <w:proofErr w:type="spellStart"/>
+      <w:r>
+        <w:rPr>
+          <w:rFonts w:ascii="Times New Roman" w:hAnsi="Times New Roman"/>
+          <w:iCs/>
+          <w:color w:val="000000" w:themeColor="text1"/>
+          <w:sz w:val="24"/>
+          <w:szCs w:val="24"/>
+        </w:rPr>
+        <w:t>Liyang</w:t>
+      </w:r>
+      <w:proofErr w:type="spellEnd"/>
+      <w:r>
+        <w:rPr>
+          <w:rFonts w:ascii="Times New Roman" w:hAnsi="Times New Roman"/>
+          <w:iCs/>
+          <w:color w:val="000000" w:themeColor="text1"/>
+          <w:sz w:val="24"/>
+          <w:szCs w:val="24"/>
+        </w:rPr>
+        <w:t xml:space="preserve"> Zhou, </w:t>
+      </w:r>
+      <w:proofErr w:type="spellStart"/>
+      <w:r>
+        <w:rPr>
+          <w:rFonts w:ascii="Times New Roman" w:hAnsi="Times New Roman"/>
+          <w:iCs/>
+          <w:color w:val="000000" w:themeColor="text1"/>
+          <w:sz w:val="24"/>
+          <w:szCs w:val="24"/>
+        </w:rPr>
+        <w:t>Hanqing</w:t>
+      </w:r>
+      <w:proofErr w:type="spellEnd"/>
+      <w:r>
+        <w:rPr>
+          <w:rFonts w:ascii="Times New Roman" w:hAnsi="Times New Roman"/>
+          <w:iCs/>
+          <w:color w:val="000000" w:themeColor="text1"/>
+          <w:sz w:val="24"/>
+          <w:szCs w:val="24"/>
+        </w:rPr>
+        <w:t xml:space="preserve"> Jiang, </w:t>
+      </w:r>
+      <w:proofErr w:type="spellStart"/>
+      <w:r>
+        <w:rPr>
+          <w:rFonts w:ascii="Times New Roman" w:hAnsi="Times New Roman"/>
+          <w:iCs/>
+          <w:color w:val="000000" w:themeColor="text1"/>
+          <w:sz w:val="24"/>
+          <w:szCs w:val="24"/>
+        </w:rPr>
+        <w:t>Zhongliang</w:t>
+      </w:r>
+      <w:proofErr w:type="spellEnd"/>
+      <w:r>
+        <w:rPr>
+          <w:rFonts w:ascii="Times New Roman" w:hAnsi="Times New Roman"/>
+          <w:iCs/>
+          <w:color w:val="000000" w:themeColor="text1"/>
+          <w:sz w:val="24"/>
+          <w:szCs w:val="24"/>
+        </w:rPr>
+        <w:t xml:space="preserve"> Tang, </w:t>
+      </w:r>
+      <w:proofErr w:type="spellStart"/>
+      <w:r>
+        <w:rPr>
+          <w:rFonts w:ascii="Times New Roman" w:hAnsi="Times New Roman"/>
+          <w:iCs/>
+          <w:color w:val="000000" w:themeColor="text1"/>
+          <w:sz w:val="24"/>
+          <w:szCs w:val="24"/>
+        </w:rPr>
+        <w:t>Yuanbo</w:t>
+      </w:r>
+      <w:proofErr w:type="spellEnd"/>
+      <w:r>
+        <w:rPr>
+          <w:rFonts w:ascii="Times New Roman" w:hAnsi="Times New Roman"/>
+          <w:iCs/>
+          <w:color w:val="000000" w:themeColor="text1"/>
+          <w:sz w:val="24"/>
+          <w:szCs w:val="24"/>
+        </w:rPr>
+        <w:t xml:space="preserve"> Wang, </w:t>
+      </w:r>
+      <w:proofErr w:type="spellStart"/>
+      <w:r>
+        <w:rPr>
+          <w:rFonts w:ascii="Times New Roman" w:hAnsi="Times New Roman"/>
+          <w:iCs/>
+          <w:color w:val="000000" w:themeColor="text1"/>
+          <w:sz w:val="24"/>
+          <w:szCs w:val="24"/>
+        </w:rPr>
+        <w:t>Hujun</w:t>
+      </w:r>
+      <w:proofErr w:type="spellEnd"/>
+      <w:r>
+        <w:rPr>
+          <w:rFonts w:ascii="Times New Roman" w:hAnsi="Times New Roman"/>
+          <w:iCs/>
+          <w:color w:val="000000" w:themeColor="text1"/>
+          <w:sz w:val="24"/>
+          <w:szCs w:val="24"/>
+        </w:rPr>
+        <w:t xml:space="preserve"> Bao, and Guofeng Zhang,</w:t>
+      </w:r>
+      <w:r>
+        <w:rPr>
+          <w:rFonts w:ascii="Times New Roman" w:hAnsi="Times New Roman"/>
+          <w:b/>
+          <w:bCs/>
+          <w:iCs/>
+          <w:color w:val="000000" w:themeColor="text1"/>
+          <w:sz w:val="24"/>
+          <w:szCs w:val="24"/>
+        </w:rPr>
+        <w:t xml:space="preserve"> “</w:t>
+      </w:r>
+      <w:r>
+        <w:rPr>
+          <w:rFonts w:ascii="Times New Roman" w:hAnsi="Times New Roman"/>
+          <w:iCs/>
+          <w:color w:val="000000" w:themeColor="text1"/>
+          <w:sz w:val="24"/>
+          <w:szCs w:val="24"/>
+        </w:rPr>
+        <w:t>Mobile3DRecon: Real-time Monocular 3D Reconstruction on a Mobile Phone</w:t>
+      </w:r>
+      <w:r>
+        <w:rPr>
+          <w:rFonts w:ascii="Times New Roman" w:hAnsi="Times New Roman"/>
+          <w:iCs/>
+          <w:color w:val="000000" w:themeColor="text1"/>
+          <w:sz w:val="24"/>
+          <w:szCs w:val="24"/>
+        </w:rPr>
+        <w:t>”,</w:t>
+      </w:r>
+      <w:r>
+        <w:rPr>
+          <w:rFonts w:ascii="Times New Roman" w:hAnsi="Times New Roman"/>
+          <w:iCs/>
+          <w:color w:val="000000" w:themeColor="text1"/>
+          <w:sz w:val="24"/>
+          <w:szCs w:val="24"/>
+        </w:rPr>
+        <w:t xml:space="preserve"> </w:t>
+      </w:r>
+      <w:r>
+        <w:rPr>
+          <w:rFonts w:ascii="Times New Roman" w:hAnsi="Times New Roman"/>
+          <w:iCs/>
+          <w:color w:val="000000" w:themeColor="text1"/>
+          <w:sz w:val="24"/>
+          <w:szCs w:val="24"/>
+        </w:rPr>
+        <w:t>I</w:t>
+      </w:r>
+      <w:r>
+        <w:rPr>
+          <w:rFonts w:ascii="Times New Roman" w:hAnsi="Times New Roman"/>
+          <w:iCs/>
+          <w:color w:val="000000" w:themeColor="text1"/>
+          <w:sz w:val="24"/>
+          <w:szCs w:val="24"/>
+        </w:rPr>
+        <w:t>EEE</w:t>
+      </w:r>
+      <w:r>
+        <w:rPr>
+          <w:rFonts w:ascii="Times New Roman" w:hAnsi="Times New Roman"/>
+          <w:iCs/>
+          <w:color w:val="000000" w:themeColor="text1"/>
+          <w:sz w:val="24"/>
+          <w:szCs w:val="24"/>
+        </w:rPr>
+        <w:t xml:space="preserve"> Transactions </w:t>
+      </w:r>
+      <w:proofErr w:type="gramStart"/>
+      <w:r>
+        <w:rPr>
+          <w:rFonts w:ascii="Times New Roman" w:hAnsi="Times New Roman"/>
+          <w:iCs/>
+          <w:color w:val="000000" w:themeColor="text1"/>
+          <w:sz w:val="24"/>
+          <w:szCs w:val="24"/>
+        </w:rPr>
+        <w:t>On</w:t>
+      </w:r>
+      <w:proofErr w:type="gramEnd"/>
+      <w:r>
+        <w:rPr>
+          <w:rFonts w:ascii="Times New Roman" w:hAnsi="Times New Roman"/>
+          <w:iCs/>
+          <w:color w:val="000000" w:themeColor="text1"/>
+          <w:sz w:val="24"/>
+          <w:szCs w:val="24"/>
+        </w:rPr>
+        <w:t xml:space="preserve"> Visualization </w:t>
+      </w:r>
+      <w:proofErr w:type="gramStart"/>
+      <w:r>
+        <w:rPr>
+          <w:rFonts w:ascii="Times New Roman" w:hAnsi="Times New Roman"/>
+          <w:iCs/>
+          <w:color w:val="000000" w:themeColor="text1"/>
+          <w:sz w:val="24"/>
+          <w:szCs w:val="24"/>
+        </w:rPr>
+        <w:t>And</w:t>
+      </w:r>
+      <w:proofErr w:type="gramEnd"/>
+      <w:r>
+        <w:rPr>
+          <w:rFonts w:ascii="Times New Roman" w:hAnsi="Times New Roman"/>
+          <w:iCs/>
+          <w:color w:val="000000" w:themeColor="text1"/>
+          <w:sz w:val="24"/>
+          <w:szCs w:val="24"/>
+        </w:rPr>
+        <w:t xml:space="preserve"> Computer Graphics, Vol. 26, No. 12, December 2020</w:t>
+      </w:r>
+    </w:p>
+    <w:p>
+      <w:pPr>
+        <w:pStyle w:val="ListParagraph"/>
+        <w:jc w:val="both"/>
+        <w:rPr>
+          <w:rFonts w:ascii="Times New Roman" w:hAnsi="Times New Roman"/>
+          <w:iCs/>
+          <w:color w:val="000000" w:themeColor="text1"/>
+          <w:sz w:val="24"/>
+          <w:szCs w:val="24"/>
+        </w:rPr>
+      </w:pPr>
+    </w:p>
+    <w:p>
+      <w:pPr>
+        <w:pStyle w:val="ListParagraph"/>
+        <w:jc w:val="both"/>
+        <w:rPr>
+          <w:rFonts w:ascii="Times New Roman" w:hAnsi="Times New Roman"/>
+          <w:iCs/>
+          <w:color w:val="000000" w:themeColor="text1"/>
+          <w:sz w:val="24"/>
+          <w:szCs w:val="24"/>
+        </w:rPr>
+      </w:pPr>
+      <w:r>
+        <w:rPr>
+          <w:rFonts w:ascii="Times New Roman" w:hAnsi="Times New Roman"/>
+          <w:iCs/>
+          <w:color w:val="000000" w:themeColor="text1"/>
+          <w:sz w:val="24"/>
+          <w:szCs w:val="24"/>
+        </w:rPr>
+        <w:t>[</w:t>
+      </w:r>
+      <w:r>
+        <w:rPr>
+          <w:rFonts w:ascii="Times New Roman" w:hAnsi="Times New Roman"/>
+          <w:iCs/>
+          <w:color w:val="000000" w:themeColor="text1"/>
+          <w:sz w:val="24"/>
+          <w:szCs w:val="24"/>
+        </w:rPr>
+        <w:t>5</w:t>
+      </w:r>
+      <w:r>
+        <w:rPr>
+          <w:rFonts w:ascii="Times New Roman" w:hAnsi="Times New Roman"/>
+          <w:iCs/>
+          <w:color w:val="000000" w:themeColor="text1"/>
+          <w:sz w:val="24"/>
+          <w:szCs w:val="24"/>
+        </w:rPr>
+        <w:t>]</w:t>
+      </w:r>
+      <w:r>
+        <w:rPr>
+          <w:rFonts w:ascii="Times New Roman" w:hAnsi="Times New Roman"/>
+          <w:iCs/>
+          <w:color w:val="000000" w:themeColor="text1"/>
+          <w:sz w:val="24"/>
+          <w:szCs w:val="24"/>
+        </w:rPr>
+        <w:t xml:space="preserve"> </w:t>
+      </w:r>
+      <w:r>
+        <w:rPr>
+          <w:rFonts w:ascii="Times New Roman" w:hAnsi="Times New Roman"/>
+          <w:iCs/>
+          <w:color w:val="000000" w:themeColor="text1"/>
+          <w:sz w:val="24"/>
+          <w:szCs w:val="24"/>
+        </w:rPr>
+        <w:t>Amel Ali Alhussan, Doaa Sami Khafaga, El-Sayed M. El-</w:t>
+      </w:r>
+      <w:proofErr w:type="spellStart"/>
+      <w:r>
+        <w:rPr>
+          <w:rFonts w:ascii="Times New Roman" w:hAnsi="Times New Roman"/>
+          <w:iCs/>
+          <w:color w:val="000000" w:themeColor="text1"/>
+          <w:sz w:val="24"/>
+          <w:szCs w:val="24"/>
+        </w:rPr>
+        <w:t>Kenawy</w:t>
+      </w:r>
+      <w:proofErr w:type="spellEnd"/>
+      <w:r>
+        <w:rPr>
+          <w:rFonts w:ascii="Times New Roman" w:hAnsi="Times New Roman"/>
+          <w:iCs/>
+          <w:color w:val="000000" w:themeColor="text1"/>
+          <w:sz w:val="24"/>
+          <w:szCs w:val="24"/>
+        </w:rPr>
+        <w:t>,</w:t>
+      </w:r>
+      <w:r>
+        <w:rPr>
+          <w:rFonts w:ascii="Times New Roman" w:hAnsi="Times New Roman"/>
+          <w:iCs/>
+          <w:color w:val="000000" w:themeColor="text1"/>
+          <w:sz w:val="24"/>
+          <w:szCs w:val="24"/>
+        </w:rPr>
+        <w:t xml:space="preserve"> </w:t>
+      </w:r>
+      <w:proofErr w:type="spellStart"/>
+      <w:r>
+        <w:rPr>
+          <w:rFonts w:ascii="Times New Roman" w:hAnsi="Times New Roman"/>
+          <w:iCs/>
+          <w:color w:val="000000" w:themeColor="text1"/>
+          <w:sz w:val="24"/>
+          <w:szCs w:val="24"/>
+        </w:rPr>
+        <w:t>Abdelhameed</w:t>
+      </w:r>
+      <w:proofErr w:type="spellEnd"/>
+      <w:r>
+        <w:rPr>
+          <w:rFonts w:ascii="Times New Roman" w:hAnsi="Times New Roman"/>
+          <w:iCs/>
+          <w:color w:val="000000" w:themeColor="text1"/>
+          <w:sz w:val="24"/>
+          <w:szCs w:val="24"/>
+        </w:rPr>
+        <w:t xml:space="preserve"> </w:t>
+      </w:r>
+      <w:proofErr w:type="gramStart"/>
+      <w:r>
+        <w:rPr>
+          <w:rFonts w:ascii="Times New Roman" w:hAnsi="Times New Roman"/>
+          <w:iCs/>
+          <w:color w:val="000000" w:themeColor="text1"/>
+          <w:sz w:val="24"/>
+          <w:szCs w:val="24"/>
+        </w:rPr>
+        <w:t>Ibrahim ,</w:t>
+      </w:r>
+      <w:proofErr w:type="gramEnd"/>
+      <w:r>
+        <w:rPr>
+          <w:rFonts w:ascii="Times New Roman" w:hAnsi="Times New Roman"/>
+          <w:iCs/>
+          <w:color w:val="000000" w:themeColor="text1"/>
+          <w:sz w:val="24"/>
+          <w:szCs w:val="24"/>
+        </w:rPr>
+        <w:t xml:space="preserve"> Marwa Metwally </w:t>
+      </w:r>
+      <w:proofErr w:type="gramStart"/>
+      <w:r>
+        <w:rPr>
+          <w:rFonts w:ascii="Times New Roman" w:hAnsi="Times New Roman"/>
+          <w:iCs/>
+          <w:color w:val="000000" w:themeColor="text1"/>
+          <w:sz w:val="24"/>
+          <w:szCs w:val="24"/>
+        </w:rPr>
+        <w:t>Eid ,</w:t>
+      </w:r>
+      <w:proofErr w:type="gramEnd"/>
+      <w:r>
+        <w:rPr>
+          <w:rFonts w:ascii="Times New Roman" w:hAnsi="Times New Roman"/>
+          <w:iCs/>
+          <w:color w:val="000000" w:themeColor="text1"/>
+          <w:sz w:val="24"/>
+          <w:szCs w:val="24"/>
+        </w:rPr>
+        <w:t xml:space="preserve"> And Abdelaziz A. Abdelhamid</w:t>
+      </w:r>
+      <w:r>
+        <w:rPr>
+          <w:rFonts w:ascii="Times New Roman" w:hAnsi="Times New Roman"/>
+          <w:iCs/>
+          <w:color w:val="000000" w:themeColor="text1"/>
+          <w:sz w:val="24"/>
+          <w:szCs w:val="24"/>
+        </w:rPr>
+        <w:t>,</w:t>
+      </w:r>
+      <w:r>
+        <w:t xml:space="preserve"> </w:t>
+      </w:r>
+      <w:r>
+        <w:t>“</w:t>
+      </w:r>
+      <w:r>
+        <w:rPr>
+          <w:rFonts w:ascii="Times New Roman" w:hAnsi="Times New Roman"/>
+          <w:iCs/>
+          <w:color w:val="000000" w:themeColor="text1"/>
+          <w:sz w:val="24"/>
+          <w:szCs w:val="24"/>
+        </w:rPr>
+        <w:t xml:space="preserve">Pothole and Plain Road Classification Using Adaptive Mutation Dipper Throated Optimization and Transfer Learning for </w:t>
+      </w:r>
+      <w:proofErr w:type="spellStart"/>
+      <w:r>
+        <w:rPr>
+          <w:rFonts w:ascii="Times New Roman" w:hAnsi="Times New Roman"/>
+          <w:iCs/>
+          <w:color w:val="000000" w:themeColor="text1"/>
+          <w:sz w:val="24"/>
+          <w:szCs w:val="24"/>
+        </w:rPr>
+        <w:t>Self Driving</w:t>
+      </w:r>
+      <w:proofErr w:type="spellEnd"/>
+      <w:r>
+        <w:rPr>
+          <w:rFonts w:ascii="Times New Roman" w:hAnsi="Times New Roman"/>
+          <w:iCs/>
+          <w:color w:val="000000" w:themeColor="text1"/>
+          <w:sz w:val="24"/>
+          <w:szCs w:val="24"/>
+        </w:rPr>
+        <w:t xml:space="preserve"> Cars</w:t>
+      </w:r>
+      <w:r>
+        <w:rPr>
+          <w:rFonts w:ascii="Times New Roman" w:hAnsi="Times New Roman"/>
+          <w:iCs/>
+          <w:color w:val="000000" w:themeColor="text1"/>
+          <w:sz w:val="24"/>
+          <w:szCs w:val="24"/>
+        </w:rPr>
+        <w:t>”,</w:t>
+      </w:r>
+      <w:r>
+        <w:rPr>
+          <w:rFonts w:ascii="Times New Roman" w:hAnsi="Times New Roman"/>
+          <w:iCs/>
+          <w:color w:val="000000" w:themeColor="text1"/>
+          <w:sz w:val="24"/>
+          <w:szCs w:val="24"/>
+        </w:rPr>
+        <w:t xml:space="preserve"> </w:t>
+      </w:r>
+      <w:r>
+        <w:rPr>
+          <w:rFonts w:ascii="Times New Roman" w:hAnsi="Times New Roman"/>
+          <w:iCs/>
+          <w:color w:val="000000" w:themeColor="text1"/>
+          <w:sz w:val="24"/>
+          <w:szCs w:val="24"/>
+        </w:rPr>
+        <w:t>IEEE Access</w:t>
+      </w:r>
+    </w:p>
+    <w:p>
+      <w:pPr>
+        <w:pStyle w:val="ListParagraph"/>
+        <w:jc w:val="both"/>
+        <w:rPr>
+          <w:rFonts w:ascii="Times New Roman" w:hAnsi="Times New Roman"/>
+          <w:iCs/>
+          <w:color w:val="000000" w:themeColor="text1"/>
+          <w:sz w:val="24"/>
+          <w:szCs w:val="24"/>
+        </w:rPr>
+      </w:pPr>
+    </w:p>
+    <w:p>
+      <w:pPr>
+        <w:pStyle w:val="ListParagraph"/>
+        <w:jc w:val="both"/>
+        <w:rPr>
+          <w:rFonts w:ascii="Times New Roman" w:hAnsi="Times New Roman"/>
+          <w:iCs/>
+          <w:color w:val="000000" w:themeColor="text1"/>
+          <w:sz w:val="24"/>
+          <w:szCs w:val="24"/>
+        </w:rPr>
+      </w:pPr>
+      <w:r>
+        <w:rPr>
+          <w:rFonts w:ascii="Times New Roman" w:hAnsi="Times New Roman"/>
+          <w:iCs/>
+          <w:color w:val="000000" w:themeColor="text1"/>
+          <w:sz w:val="24"/>
+          <w:szCs w:val="24"/>
+        </w:rPr>
+        <w:t>[6]</w:t>
+      </w:r>
+      <w:r>
+        <w:rPr>
+          <w:rFonts w:ascii="Times New Roman" w:hAnsi="Times New Roman"/>
+          <w:iCs/>
+          <w:color w:val="000000" w:themeColor="text1"/>
+          <w:sz w:val="24"/>
+          <w:szCs w:val="24"/>
+        </w:rPr>
+        <w:t xml:space="preserve"> </w:t>
+      </w:r>
+      <w:r>
+        <w:rPr>
+          <w:rFonts w:ascii="Times New Roman" w:hAnsi="Times New Roman"/>
+          <w:iCs/>
+          <w:color w:val="000000" w:themeColor="text1"/>
+          <w:sz w:val="24"/>
+          <w:szCs w:val="24"/>
+        </w:rPr>
+        <w:t xml:space="preserve">Siim </w:t>
+      </w:r>
+      <w:proofErr w:type="spellStart"/>
+      <w:r>
+        <w:rPr>
+          <w:rFonts w:ascii="Times New Roman" w:hAnsi="Times New Roman"/>
+          <w:iCs/>
+          <w:color w:val="000000" w:themeColor="text1"/>
+          <w:sz w:val="24"/>
+          <w:szCs w:val="24"/>
+        </w:rPr>
+        <w:t>Meerits</w:t>
+      </w:r>
+      <w:proofErr w:type="spellEnd"/>
+      <w:r>
+        <w:rPr>
+          <w:rFonts w:ascii="Times New Roman" w:hAnsi="Times New Roman"/>
+          <w:iCs/>
+          <w:color w:val="000000" w:themeColor="text1"/>
+          <w:sz w:val="24"/>
+          <w:szCs w:val="24"/>
+        </w:rPr>
+        <w:t xml:space="preserve">, </w:t>
+      </w:r>
+      <w:r>
+        <w:rPr>
+          <w:rFonts w:ascii="Times New Roman" w:hAnsi="Times New Roman"/>
+          <w:iCs/>
+          <w:color w:val="000000" w:themeColor="text1"/>
+          <w:sz w:val="24"/>
+          <w:szCs w:val="24"/>
+        </w:rPr>
+        <w:t>Vincent Nozick</w:t>
+      </w:r>
+      <w:r>
+        <w:rPr>
+          <w:rFonts w:ascii="Times New Roman" w:hAnsi="Times New Roman"/>
+          <w:iCs/>
+          <w:color w:val="000000" w:themeColor="text1"/>
+          <w:sz w:val="24"/>
+          <w:szCs w:val="24"/>
+        </w:rPr>
+        <w:t>,</w:t>
+      </w:r>
+      <w:r>
+        <w:rPr>
+          <w:rFonts w:ascii="Times New Roman" w:hAnsi="Times New Roman"/>
+          <w:iCs/>
+          <w:color w:val="000000" w:themeColor="text1"/>
+          <w:sz w:val="24"/>
+          <w:szCs w:val="24"/>
+        </w:rPr>
+        <w:t xml:space="preserve"> Hideo Saito</w:t>
+      </w:r>
+      <w:r>
+        <w:rPr>
+          <w:rFonts w:ascii="Times New Roman" w:hAnsi="Times New Roman"/>
+          <w:iCs/>
+          <w:color w:val="000000" w:themeColor="text1"/>
+          <w:sz w:val="24"/>
+          <w:szCs w:val="24"/>
+        </w:rPr>
+        <w:t>, “</w:t>
+      </w:r>
+      <w:r>
+        <w:rPr>
+          <w:rFonts w:ascii="Times New Roman" w:hAnsi="Times New Roman"/>
+          <w:iCs/>
+          <w:color w:val="000000" w:themeColor="text1"/>
+          <w:sz w:val="24"/>
+          <w:szCs w:val="24"/>
+        </w:rPr>
+        <w:t>Real-time scene reconstruction and triangle mesh generation</w:t>
+      </w:r>
+      <w:r>
+        <w:rPr>
+          <w:rFonts w:ascii="Times New Roman" w:hAnsi="Times New Roman"/>
+          <w:iCs/>
+          <w:color w:val="000000" w:themeColor="text1"/>
+          <w:sz w:val="24"/>
+          <w:szCs w:val="24"/>
+        </w:rPr>
+        <w:t xml:space="preserve"> </w:t>
+      </w:r>
+      <w:r>
+        <w:rPr>
+          <w:rFonts w:ascii="Times New Roman" w:hAnsi="Times New Roman"/>
+          <w:iCs/>
+          <w:color w:val="000000" w:themeColor="text1"/>
+          <w:sz w:val="24"/>
+          <w:szCs w:val="24"/>
+        </w:rPr>
+        <w:t>using multiple RGB-D cameras</w:t>
+      </w:r>
+      <w:r>
+        <w:rPr>
+          <w:rFonts w:ascii="Times New Roman" w:hAnsi="Times New Roman"/>
+          <w:iCs/>
+          <w:color w:val="000000" w:themeColor="text1"/>
+          <w:sz w:val="24"/>
+          <w:szCs w:val="24"/>
+        </w:rPr>
+        <w:t>”,</w:t>
+      </w:r>
+      <w:r>
+        <w:t xml:space="preserve"> </w:t>
+      </w:r>
+      <w:r>
+        <w:rPr>
+          <w:rFonts w:ascii="Times New Roman" w:hAnsi="Times New Roman"/>
+          <w:iCs/>
+          <w:color w:val="000000" w:themeColor="text1"/>
+          <w:sz w:val="24"/>
+          <w:szCs w:val="24"/>
+        </w:rPr>
+        <w:t>J Real-Time Image Proc (2019) 16:2247–2259</w:t>
+      </w:r>
+    </w:p>
+    <w:p>
+      <w:pPr>
+        <w:pStyle w:val="ListParagraph"/>
+        <w:jc w:val="both"/>
+        <w:rPr>
+          <w:rFonts w:ascii="Times New Roman" w:hAnsi="Times New Roman"/>
+          <w:iCs/>
+          <w:color w:val="000000" w:themeColor="text1"/>
+          <w:sz w:val="24"/>
+          <w:szCs w:val="24"/>
+        </w:rPr>
+      </w:pPr>
     </w:p>
     <w:p>
       <w:pPr>
@@ -19490,303 +21302,9 @@
           <w:szCs w:val="24"/>
         </w:rPr>
       </w:pPr>
-      <w:r>
-        <w:rPr>
-          <w:rFonts w:ascii="Times New Roman" w:hAnsi="Times New Roman"/>
-          <w:iCs/>
-          <w:color w:val="000000" w:themeColor="text1"/>
-          <w:sz w:val="24"/>
-          <w:szCs w:val="24"/>
-        </w:rPr>
-        <w:t xml:space="preserve">[1] </w:t>
-      </w:r>
-      <w:hyperlink r:id="rId15" w:history="1">
-        <w:r>
-          <w:rPr>
-            <w:rStyle w:val="Hyperlink"/>
-            <w:rFonts w:ascii="Times New Roman" w:hAnsi="Times New Roman"/>
-            <w:iCs/>
-            <w:color w:val="000000" w:themeColor="text1"/>
-            <w:sz w:val="24"/>
-            <w:szCs w:val="24"/>
-            <w:u w:val="none"/>
-          </w:rPr>
-          <w:t>Deep Learning Enhanced Feature Extraction</w:t>
-        </w:r>
-      </w:hyperlink>
-    </w:p>
-    <w:p>
-      <w:pPr>
-        <w:pStyle w:val="ListParagraph"/>
-        <w:spacing w:line="240" w:lineRule="auto"/>
-        <w:ind w:left="0"/>
-        <w:jc w:val="both"/>
-        <w:rPr>
-          <w:rFonts w:ascii="Times New Roman" w:hAnsi="Times New Roman"/>
-          <w:iCs/>
-          <w:color w:val="000000" w:themeColor="text1"/>
-          <w:sz w:val="24"/>
-          <w:szCs w:val="24"/>
-        </w:rPr>
-      </w:pPr>
-    </w:p>
-    <w:p>
-      <w:pPr>
-        <w:pStyle w:val="ListParagraph"/>
-        <w:spacing w:line="240" w:lineRule="auto"/>
-        <w:ind w:left="0"/>
-        <w:jc w:val="both"/>
-        <w:rPr>
-          <w:rFonts w:ascii="Times New Roman" w:hAnsi="Times New Roman"/>
-          <w:iCs/>
-          <w:color w:val="000000" w:themeColor="text1"/>
-          <w:sz w:val="24"/>
-          <w:szCs w:val="24"/>
-        </w:rPr>
-      </w:pPr>
-      <w:r>
-        <w:rPr>
-          <w:rFonts w:ascii="Times New Roman" w:hAnsi="Times New Roman"/>
-          <w:iCs/>
-          <w:color w:val="000000" w:themeColor="text1"/>
-          <w:sz w:val="24"/>
-          <w:szCs w:val="24"/>
-        </w:rPr>
-        <w:t xml:space="preserve">[2] </w:t>
-      </w:r>
-      <w:hyperlink r:id="rId16" w:history="1">
-        <w:r>
-          <w:rPr>
-            <w:rStyle w:val="Hyperlink"/>
-            <w:rFonts w:ascii="Times New Roman" w:hAnsi="Times New Roman"/>
-            <w:iCs/>
-            <w:color w:val="000000" w:themeColor="text1"/>
-            <w:sz w:val="24"/>
-            <w:szCs w:val="24"/>
-            <w:u w:val="none"/>
-          </w:rPr>
-          <w:t>An Enhanced YOLOv8 Model for Real-Time and Accurate Pothole Detection and Measurement</w:t>
-        </w:r>
-      </w:hyperlink>
-    </w:p>
-    <w:p>
-      <w:pPr>
-        <w:pStyle w:val="ListParagraph"/>
-        <w:spacing w:line="240" w:lineRule="auto"/>
-        <w:ind w:left="0"/>
-        <w:jc w:val="both"/>
-        <w:rPr>
-          <w:rFonts w:ascii="Times New Roman" w:hAnsi="Times New Roman"/>
-          <w:iCs/>
-          <w:color w:val="000000" w:themeColor="text1"/>
-          <w:sz w:val="24"/>
-          <w:szCs w:val="24"/>
-        </w:rPr>
-      </w:pPr>
-    </w:p>
-    <w:p>
-      <w:pPr>
-        <w:pStyle w:val="ListParagraph"/>
-        <w:spacing w:line="240" w:lineRule="auto"/>
-        <w:ind w:left="0"/>
-        <w:jc w:val="both"/>
-        <w:rPr>
-          <w:rFonts w:ascii="Times New Roman" w:hAnsi="Times New Roman"/>
-          <w:iCs/>
-          <w:color w:val="000000" w:themeColor="text1"/>
-          <w:sz w:val="24"/>
-          <w:szCs w:val="24"/>
-        </w:rPr>
-      </w:pPr>
-      <w:r>
-        <w:rPr>
-          <w:rFonts w:ascii="Times New Roman" w:hAnsi="Times New Roman"/>
-          <w:iCs/>
-          <w:color w:val="000000" w:themeColor="text1"/>
-          <w:sz w:val="24"/>
-          <w:szCs w:val="24"/>
-        </w:rPr>
-        <w:t xml:space="preserve">[3] </w:t>
-      </w:r>
-      <w:hyperlink r:id="rId17" w:history="1">
-        <w:r>
-          <w:rPr>
-            <w:rStyle w:val="Hyperlink"/>
-            <w:rFonts w:ascii="Times New Roman" w:hAnsi="Times New Roman"/>
-            <w:iCs/>
-            <w:color w:val="000000" w:themeColor="text1"/>
-            <w:sz w:val="24"/>
-            <w:szCs w:val="24"/>
-            <w:u w:val="none"/>
-          </w:rPr>
-          <w:t>Robust Video Based Pothole Detection and Area Estimation for Intelligent Vehicles with Depth Map and Kalman Smoothing</w:t>
-        </w:r>
-      </w:hyperlink>
-    </w:p>
-    <w:p>
-      <w:pPr>
-        <w:pStyle w:val="ListParagraph"/>
-        <w:spacing w:line="240" w:lineRule="auto"/>
-        <w:ind w:left="0"/>
-        <w:jc w:val="both"/>
-        <w:rPr>
-          <w:rFonts w:ascii="Times New Roman" w:hAnsi="Times New Roman"/>
-          <w:iCs/>
-          <w:color w:val="000000" w:themeColor="text1"/>
-          <w:sz w:val="24"/>
-          <w:szCs w:val="24"/>
-        </w:rPr>
-      </w:pPr>
-    </w:p>
-    <w:p>
-      <w:pPr>
-        <w:pStyle w:val="ListParagraph"/>
-        <w:spacing w:line="240" w:lineRule="auto"/>
-        <w:ind w:left="0"/>
-        <w:jc w:val="both"/>
-        <w:rPr>
-          <w:rFonts w:ascii="Times New Roman" w:hAnsi="Times New Roman"/>
-          <w:iCs/>
-          <w:color w:val="000000" w:themeColor="text1"/>
-          <w:sz w:val="24"/>
-          <w:szCs w:val="24"/>
-        </w:rPr>
-      </w:pPr>
-      <w:r>
-        <w:rPr>
-          <w:rFonts w:ascii="Times New Roman" w:hAnsi="Times New Roman"/>
-          <w:iCs/>
-          <w:color w:val="000000" w:themeColor="text1"/>
-          <w:sz w:val="24"/>
-          <w:szCs w:val="24"/>
-        </w:rPr>
-        <w:t xml:space="preserve">[4] </w:t>
-      </w:r>
-      <w:hyperlink r:id="rId18" w:history="1">
-        <w:r>
-          <w:rPr>
-            <w:rStyle w:val="Hyperlink"/>
-            <w:rFonts w:ascii="Times New Roman" w:hAnsi="Times New Roman"/>
-            <w:iCs/>
-            <w:color w:val="000000" w:themeColor="text1"/>
-            <w:sz w:val="24"/>
-            <w:szCs w:val="24"/>
-            <w:u w:val="none"/>
-          </w:rPr>
-          <w:t xml:space="preserve">Mobile3DRecon: Real-time Monocular 3D Reconstruction on a Mobile Phone </w:t>
-        </w:r>
-      </w:hyperlink>
-    </w:p>
-    <w:p>
-      <w:pPr>
-        <w:pStyle w:val="ListParagraph"/>
-        <w:spacing w:line="240" w:lineRule="auto"/>
-        <w:ind w:left="0"/>
-        <w:jc w:val="both"/>
-        <w:rPr>
-          <w:rFonts w:ascii="Times New Roman" w:hAnsi="Times New Roman"/>
-          <w:iCs/>
-          <w:color w:val="000000" w:themeColor="text1"/>
-          <w:sz w:val="24"/>
-          <w:szCs w:val="24"/>
-        </w:rPr>
-      </w:pPr>
-    </w:p>
-    <w:p>
-      <w:pPr>
-        <w:pStyle w:val="ListParagraph"/>
-        <w:spacing w:line="240" w:lineRule="auto"/>
-        <w:ind w:left="0"/>
-        <w:jc w:val="both"/>
-        <w:rPr>
-          <w:rFonts w:ascii="Times New Roman" w:hAnsi="Times New Roman"/>
-          <w:iCs/>
-          <w:color w:val="000000" w:themeColor="text1"/>
-          <w:sz w:val="24"/>
-          <w:szCs w:val="24"/>
-        </w:rPr>
-      </w:pPr>
-      <w:r>
-        <w:rPr>
-          <w:rFonts w:ascii="Times New Roman" w:hAnsi="Times New Roman"/>
-          <w:iCs/>
-          <w:color w:val="000000" w:themeColor="text1"/>
-          <w:sz w:val="24"/>
-          <w:szCs w:val="24"/>
-        </w:rPr>
-        <w:t xml:space="preserve">[5] </w:t>
-      </w:r>
-      <w:hyperlink r:id="rId19" w:history="1">
-        <w:r>
-          <w:rPr>
-            <w:rStyle w:val="Hyperlink"/>
-            <w:rFonts w:ascii="Times New Roman" w:hAnsi="Times New Roman"/>
-            <w:iCs/>
-            <w:color w:val="000000" w:themeColor="text1"/>
-            <w:sz w:val="24"/>
-            <w:szCs w:val="24"/>
-            <w:u w:val="none"/>
-          </w:rPr>
-          <w:t xml:space="preserve">Pothole and Plain Road Classification Using Adaptive Mutation Dipper Throated Optimization and Transfer Learning for Self-Driving Cars. </w:t>
-        </w:r>
-      </w:hyperlink>
-    </w:p>
-    <w:p>
-      <w:pPr>
-        <w:pStyle w:val="ListParagraph"/>
-        <w:spacing w:line="240" w:lineRule="auto"/>
-        <w:ind w:left="0"/>
-        <w:jc w:val="both"/>
-        <w:rPr>
-          <w:rFonts w:ascii="Times New Roman" w:hAnsi="Times New Roman"/>
-          <w:iCs/>
-          <w:color w:val="000000" w:themeColor="text1"/>
-          <w:sz w:val="24"/>
-          <w:szCs w:val="24"/>
-        </w:rPr>
-      </w:pPr>
-    </w:p>
-    <w:p>
-      <w:pPr>
-        <w:pStyle w:val="ListParagraph"/>
-        <w:spacing w:line="240" w:lineRule="auto"/>
-        <w:ind w:left="0"/>
-        <w:jc w:val="both"/>
-        <w:rPr>
-          <w:rFonts w:ascii="Times New Roman" w:hAnsi="Times New Roman"/>
-          <w:iCs/>
-          <w:color w:val="000000" w:themeColor="text1"/>
-          <w:sz w:val="24"/>
-          <w:szCs w:val="24"/>
-        </w:rPr>
-      </w:pPr>
-      <w:r>
-        <w:rPr>
-          <w:rFonts w:ascii="Times New Roman" w:hAnsi="Times New Roman"/>
-          <w:iCs/>
-          <w:color w:val="000000" w:themeColor="text1"/>
-          <w:sz w:val="24"/>
-          <w:szCs w:val="24"/>
-        </w:rPr>
-        <w:t xml:space="preserve">[6] </w:t>
-      </w:r>
-      <w:hyperlink r:id="rId20" w:history="1">
-        <w:r>
-          <w:rPr>
-            <w:rStyle w:val="Hyperlink"/>
-            <w:rFonts w:ascii="Times New Roman" w:hAnsi="Times New Roman"/>
-            <w:iCs/>
-            <w:color w:val="000000" w:themeColor="text1"/>
-            <w:sz w:val="24"/>
-            <w:szCs w:val="24"/>
-            <w:u w:val="none"/>
-          </w:rPr>
-          <w:t xml:space="preserve">Real-time scene reconstruction and triangle mesh generation using multiple RGB-D cameras </w:t>
-        </w:r>
-      </w:hyperlink>
     </w:p>
     <w:sectPr>
-      <w:footerReference w:type="default" r:id="rId21"/>
+      <w:footerReference w:type="default" r:id="rId18"/>
       <w:pgSz w:w="12240" w:h="15840"/>
       <w:pgMar w:top="994" w:right="1440" w:bottom="806" w:left="1440" w:header="720" w:footer="720" w:gutter="0"/>
       <w:pgNumType w:start="1"/>
@@ -22322,7 +23840,7 @@
   <w:style w:type="paragraph" w:default="1" w:styleId="Normal">
     <w:name w:val="Normal"/>
     <w:qFormat/>
-    <w:rsid w:val="00653EA7"/>
+    <w:rsid w:val="002B0A36"/>
     <w:pPr>
       <w:spacing w:after="200" w:line="276" w:lineRule="auto"/>
     </w:pPr>
@@ -22382,7 +23900,6 @@
   <w:style w:type="character" w:default="1" w:styleId="DefaultParagraphFont">
     <w:name w:val="Default Paragraph Font"/>
     <w:uiPriority w:val="1"/>
-    <w:semiHidden/>
     <w:unhideWhenUsed/>
   </w:style>
   <w:style w:type="table" w:default="1" w:styleId="TableNormal">
@@ -22625,6 +24142,18 @@
     <w:rPr>
       <w:color w:val="605E5C"/>
       <w:shd w:val="clear" w:color="auto" w:fill="E1DFDD"/>
+    </w:rPr>
+  </w:style>
+  <w:style w:type="character" w:styleId="FollowedHyperlink">
+    <w:name w:val="FollowedHyperlink"/>
+    <w:basedOn w:val="DefaultParagraphFont"/>
+    <w:uiPriority w:val="99"/>
+    <w:semiHidden/>
+    <w:unhideWhenUsed/>
+    <w:rsid w:val="00EE2A88"/>
+    <w:rPr>
+      <w:color w:val="800080" w:themeColor="followedHyperlink"/>
+      <w:u w:val="single"/>
     </w:rPr>
   </w:style>
 </w:styles>

</xml_diff>